<commit_message>
docs: version manuel utilisateur → v2.13.0
Co-Authored-By: Claude Sonnet 4.6 <noreply@anthropic.com>
</commit_message>
<xml_diff>
--- a/docs/manuel-utilisateur.docx
+++ b/docs/manuel-utilisateur.docx
@@ -2731,7 +2731,7 @@
         <w:t xml:space="preserve"> </w:t>
       </w:r>
       <w:r>
-        <w:t xml:space="preserve">(nouveau en v2.11.0), configurez les valeurs par défaut qui seront pré-remplies sur chaque nouvelle facture :</w:t>
+        <w:t xml:space="preserve">(nouveau en v2.13.0), configurez les valeurs par défaut qui seront pré-remplies sur chaque nouvelle facture :</w:t>
       </w:r>
     </w:p>
     <w:tbl>
@@ -8024,13 +8024,13 @@
       </w:r>
     </w:p>
     <w:bookmarkEnd w:id="90"/>
-    <w:bookmarkStart w:id="94" w:name="nouveaux-champs-sur-les-factures-v2.11.0"/>
+    <w:bookmarkStart w:id="94" w:name="nouveaux-champs-sur-les-factures-v2.13.0"/>
     <w:p>
       <w:pPr>
         <w:pStyle w:val="Heading2"/>
       </w:pPr>
       <w:r>
-        <w:t xml:space="preserve">Nouveaux champs sur les factures (v2.11.0)</w:t>
+        <w:t xml:space="preserve">Nouveaux champs sur les factures (v2.13.0)</w:t>
       </w:r>
     </w:p>
     <w:p>
@@ -8774,13 +8774,13 @@
       </w:r>
     </w:p>
     <w:bookmarkEnd w:id="102"/>
-    <w:bookmarkStart w:id="103" w:name="signature-électronique-v2.11.0"/>
+    <w:bookmarkStart w:id="103" w:name="signature-électronique-v2.13.0"/>
     <w:p>
       <w:pPr>
         <w:pStyle w:val="Heading2"/>
       </w:pPr>
       <w:r>
-        <w:t xml:space="preserve">Signature électronique (v2.11.0)</w:t>
+        <w:t xml:space="preserve">Signature électronique (v2.13.0)</w:t>
       </w:r>
     </w:p>
     <w:p>
@@ -9437,7 +9437,7 @@
         <w:pStyle w:val="FirstParagraph"/>
       </w:pPr>
       <w:r>
-        <w:t xml:space="preserve">Depuis v2.11.0, chaque facture dispose des champs légaux obligatoires (art. L441-9/L441-10 CCom) :</w:t>
+        <w:t xml:space="preserve">Depuis v2.13.0, chaque facture dispose des champs légaux obligatoires (art. L441-9/L441-10 CCom) :</w:t>
       </w:r>
     </w:p>
     <w:tbl>
@@ -11949,7 +11949,7 @@
         <w:pStyle w:val="FirstParagraph"/>
       </w:pPr>
       <w:r>
-        <w:t xml:space="preserve">Depuis v2.11.0,</w:t>
+        <w:t xml:space="preserve">Depuis v2.13.0,</w:t>
       </w:r>
       <w:r>
         <w:t xml:space="preserve"> </w:t>
@@ -13444,13 +13444,13 @@
       </w:r>
     </w:p>
     <w:bookmarkEnd w:id="174"/>
-    <w:bookmarkStart w:id="178" w:name="relances-automatiques-v2.11.0"/>
+    <w:bookmarkStart w:id="178" w:name="relances-automatiques-v2.13.0"/>
     <w:p>
       <w:pPr>
         <w:pStyle w:val="Heading1"/>
       </w:pPr>
       <w:r>
-        <w:t xml:space="preserve">Relances automatiques (v2.11.0)</w:t>
+        <w:t xml:space="preserve">Relances automatiques (v2.13.0)</w:t>
       </w:r>
     </w:p>
     <w:p>
@@ -14955,7 +14955,7 @@
           <w:i/>
           <w:iCs/>
         </w:rPr>
-        <w:t xml:space="preserve">Document généré par FacturPro v2.11.0 — 2026</w:t>
+        <w:t xml:space="preserve">Document généré par FacturPro v2.13.0 — 2026</w:t>
       </w:r>
     </w:p>
     <w:bookmarkEnd w:id="195"/>

</xml_diff>

<commit_message>
docs: mettre a jour le manuel utilisateur pour la nouvelle barre laterale categorisee
La navigation laterale a ete reorganisee en categories repliables (Ventes,
Achats, Comptabilite). Reecriture de la section Navigation laterale et
recapture du screenshot du tableau de bord pour refleter la nouvelle
structure.

Co-Authored-By: Claude Sonnet 4.6 <noreply@anthropic.com>
</commit_message>
<xml_diff>
--- a/docs/manuel-utilisateur.docx
+++ b/docs/manuel-utilisateur.docx
@@ -1262,7 +1262,7 @@
         <w:pStyle w:val="FirstParagraph"/>
       </w:pPr>
       <w:r>
-        <w:t xml:space="preserve">La barre de gauche donne accès à toutes les rubriques. Sur mobile ou petit écran, elle se replie avec le bouton</w:t>
+        <w:t xml:space="preserve">La barre de gauche donne accès à toutes les rubriques, regroupées par catégories repliables. Sur mobile ou petit écran, elle se replie avec le bouton</w:t>
       </w:r>
       <w:r>
         <w:t xml:space="preserve"> </w:t>
@@ -1279,6 +1279,14 @@
       </w:r>
       <w:r>
         <w:t xml:space="preserve">et peut être rouverte avec le même bouton.</w:t>
+      </w:r>
+    </w:p>
+    <w:p>
+      <w:pPr>
+        <w:pStyle w:val="BodyText"/>
+      </w:pPr>
+      <w:r>
+        <w:t xml:space="preserve">Trois rubriques restent toujours visibles en haut de la barre :</w:t>
       </w:r>
     </w:p>
     <w:tbl>
@@ -1374,6 +1382,117 @@
               <w:pStyle w:val="Compact"/>
             </w:pPr>
             <w:r>
+              <w:t xml:space="preserve">⚙️</w:t>
+            </w:r>
+          </w:p>
+        </w:tc>
+        <w:tc>
+          <w:tcPr/>
+          <w:p>
+            <w:pPr>
+              <w:pStyle w:val="Compact"/>
+            </w:pPr>
+            <w:r>
+              <w:t xml:space="preserve">Paramètres</w:t>
+            </w:r>
+          </w:p>
+        </w:tc>
+      </w:tr>
+    </w:tbl>
+    <w:p>
+      <w:pPr>
+        <w:pStyle w:val="BodyText"/>
+      </w:pPr>
+      <w:r>
+        <w:t xml:space="preserve">Les autres rubriques sont organisées en</w:t>
+      </w:r>
+      <w:r>
+        <w:t xml:space="preserve"> </w:t>
+      </w:r>
+      <w:r>
+        <w:rPr>
+          <w:b/>
+          <w:bCs/>
+        </w:rPr>
+        <w:t xml:space="preserve">catégories cliquables</w:t>
+      </w:r>
+      <w:r>
+        <w:t xml:space="preserve"> </w:t>
+      </w:r>
+      <w:r>
+        <w:t xml:space="preserve">(icône</w:t>
+      </w:r>
+      <w:r>
+        <w:t xml:space="preserve"> </w:t>
+      </w:r>
+      <w:r>
+        <w:rPr>
+          <w:b/>
+          <w:bCs/>
+        </w:rPr>
+        <w:t xml:space="preserve">▾</w:t>
+      </w:r>
+      <w:r>
+        <w:t xml:space="preserve">) qui se déplient pour révéler leurs sous-rubriques ; cliquer à nouveau sur l’en-tête de catégorie la replie :</w:t>
+      </w:r>
+    </w:p>
+    <w:p>
+      <w:pPr>
+        <w:pStyle w:val="BodyText"/>
+      </w:pPr>
+      <w:r>
+        <w:rPr>
+          <w:b/>
+          <w:bCs/>
+        </w:rPr>
+        <w:t xml:space="preserve">🛍️ Ventes ▾</w:t>
+      </w:r>
+    </w:p>
+    <w:tbl>
+      <w:tblPr>
+        <w:tblStyle w:val="Table"/>
+        <w:tblW w:type="auto" w:w="0"/>
+        <w:tblLook w:firstRow="1" w:lastRow="0" w:firstColumn="0" w:lastColumn="0" w:noHBand="0" w:noVBand="0" w:val="0020"/>
+      </w:tblPr>
+      <w:tblGrid>
+        <w:gridCol w:w="3960"/>
+        <w:gridCol w:w="3960"/>
+      </w:tblGrid>
+      <w:tr>
+        <w:trPr>
+          <w:tblHeader w:val="on"/>
+        </w:trPr>
+        <w:tc>
+          <w:tcPr/>
+          <w:p>
+            <w:pPr>
+              <w:pStyle w:val="Compact"/>
+            </w:pPr>
+            <w:r>
+              <w:t xml:space="preserve">Icône</w:t>
+            </w:r>
+          </w:p>
+        </w:tc>
+        <w:tc>
+          <w:tcPr/>
+          <w:p>
+            <w:pPr>
+              <w:pStyle w:val="Compact"/>
+            </w:pPr>
+            <w:r>
+              <w:t xml:space="preserve">Rubrique</w:t>
+            </w:r>
+          </w:p>
+        </w:tc>
+      </w:tr>
+      <w:tr>
+        <w:tc>
+          <w:tcPr/>
+          <w:p>
+            <w:pPr>
+              <w:pStyle w:val="Compact"/>
+            </w:pPr>
+            <w:r>
               <w:t xml:space="preserve">🧑</w:t>
             </w:r>
           </w:p>
@@ -1534,6 +1653,274 @@
           </w:p>
         </w:tc>
       </w:tr>
+    </w:tbl>
+    <w:p>
+      <w:pPr>
+        <w:pStyle w:val="BodyText"/>
+      </w:pPr>
+      <w:r>
+        <w:rPr>
+          <w:b/>
+          <w:bCs/>
+        </w:rPr>
+        <w:t xml:space="preserve">🛒 Achats ▾</w:t>
+      </w:r>
+    </w:p>
+    <w:tbl>
+      <w:tblPr>
+        <w:tblStyle w:val="Table"/>
+        <w:tblW w:type="auto" w:w="0"/>
+        <w:tblLook w:firstRow="1" w:lastRow="0" w:firstColumn="0" w:lastColumn="0" w:noHBand="0" w:noVBand="0" w:val="0020"/>
+      </w:tblPr>
+      <w:tblGrid>
+        <w:gridCol w:w="3960"/>
+        <w:gridCol w:w="3960"/>
+      </w:tblGrid>
+      <w:tr>
+        <w:trPr>
+          <w:tblHeader w:val="on"/>
+        </w:trPr>
+        <w:tc>
+          <w:tcPr/>
+          <w:p>
+            <w:pPr>
+              <w:pStyle w:val="Compact"/>
+            </w:pPr>
+            <w:r>
+              <w:t xml:space="preserve">Icône</w:t>
+            </w:r>
+          </w:p>
+        </w:tc>
+        <w:tc>
+          <w:tcPr/>
+          <w:p>
+            <w:pPr>
+              <w:pStyle w:val="Compact"/>
+            </w:pPr>
+            <w:r>
+              <w:t xml:space="preserve">Rubrique</w:t>
+            </w:r>
+          </w:p>
+        </w:tc>
+      </w:tr>
+      <w:tr>
+        <w:tc>
+          <w:tcPr/>
+          <w:p>
+            <w:pPr>
+              <w:pStyle w:val="Compact"/>
+            </w:pPr>
+            <w:r>
+              <w:t xml:space="preserve">🏭</w:t>
+            </w:r>
+          </w:p>
+        </w:tc>
+        <w:tc>
+          <w:tcPr/>
+          <w:p>
+            <w:pPr>
+              <w:pStyle w:val="Compact"/>
+            </w:pPr>
+            <w:r>
+              <w:t xml:space="preserve">Fournisseurs</w:t>
+            </w:r>
+          </w:p>
+        </w:tc>
+      </w:tr>
+      <w:tr>
+        <w:tc>
+          <w:tcPr/>
+          <w:p>
+            <w:pPr>
+              <w:pStyle w:val="Compact"/>
+            </w:pPr>
+            <w:r>
+              <w:t xml:space="preserve">📝</w:t>
+            </w:r>
+          </w:p>
+        </w:tc>
+        <w:tc>
+          <w:tcPr/>
+          <w:p>
+            <w:pPr>
+              <w:pStyle w:val="Compact"/>
+            </w:pPr>
+            <w:r>
+              <w:t xml:space="preserve">Commandes</w:t>
+            </w:r>
+          </w:p>
+        </w:tc>
+      </w:tr>
+      <w:tr>
+        <w:tc>
+          <w:tcPr/>
+          <w:p>
+            <w:pPr>
+              <w:pStyle w:val="Compact"/>
+            </w:pPr>
+            <w:r>
+              <w:t xml:space="preserve">📥</w:t>
+            </w:r>
+          </w:p>
+        </w:tc>
+        <w:tc>
+          <w:tcPr/>
+          <w:p>
+            <w:pPr>
+              <w:pStyle w:val="Compact"/>
+            </w:pPr>
+            <w:r>
+              <w:t xml:space="preserve">Factures d’achats</w:t>
+            </w:r>
+          </w:p>
+        </w:tc>
+      </w:tr>
+    </w:tbl>
+    <w:p>
+      <w:pPr>
+        <w:pStyle w:val="BodyText"/>
+      </w:pPr>
+      <w:r>
+        <w:rPr>
+          <w:b/>
+          <w:bCs/>
+        </w:rPr>
+        <w:t xml:space="preserve">🧮 Comptabilité ▾</w:t>
+      </w:r>
+    </w:p>
+    <w:tbl>
+      <w:tblPr>
+        <w:tblStyle w:val="Table"/>
+        <w:tblW w:type="auto" w:w="0"/>
+        <w:tblLook w:firstRow="1" w:lastRow="0" w:firstColumn="0" w:lastColumn="0" w:noHBand="0" w:noVBand="0" w:val="0020"/>
+      </w:tblPr>
+      <w:tblGrid>
+        <w:gridCol w:w="3960"/>
+        <w:gridCol w:w="3960"/>
+      </w:tblGrid>
+      <w:tr>
+        <w:trPr>
+          <w:tblHeader w:val="on"/>
+        </w:trPr>
+        <w:tc>
+          <w:tcPr/>
+          <w:p>
+            <w:pPr>
+              <w:pStyle w:val="Compact"/>
+            </w:pPr>
+            <w:r>
+              <w:t xml:space="preserve">Icône</w:t>
+            </w:r>
+          </w:p>
+        </w:tc>
+        <w:tc>
+          <w:tcPr/>
+          <w:p>
+            <w:pPr>
+              <w:pStyle w:val="Compact"/>
+            </w:pPr>
+            <w:r>
+              <w:t xml:space="preserve">Rubrique</w:t>
+            </w:r>
+          </w:p>
+        </w:tc>
+      </w:tr>
+      <w:tr>
+        <w:tc>
+          <w:tcPr/>
+          <w:p>
+            <w:pPr>
+              <w:pStyle w:val="Compact"/>
+            </w:pPr>
+            <w:r>
+              <w:t xml:space="preserve">📑</w:t>
+            </w:r>
+          </w:p>
+        </w:tc>
+        <w:tc>
+          <w:tcPr/>
+          <w:p>
+            <w:pPr>
+              <w:pStyle w:val="Compact"/>
+            </w:pPr>
+            <w:r>
+              <w:t xml:space="preserve">Déclaration TVA</w:t>
+            </w:r>
+          </w:p>
+        </w:tc>
+      </w:tr>
+      <w:tr>
+        <w:tc>
+          <w:tcPr/>
+          <w:p>
+            <w:pPr>
+              <w:pStyle w:val="Compact"/>
+            </w:pPr>
+            <w:r>
+              <w:t xml:space="preserve">⚖️</w:t>
+            </w:r>
+          </w:p>
+        </w:tc>
+        <w:tc>
+          <w:tcPr/>
+          <w:p>
+            <w:pPr>
+              <w:pStyle w:val="Compact"/>
+            </w:pPr>
+            <w:r>
+              <w:t xml:space="preserve">Lettrage</w:t>
+            </w:r>
+          </w:p>
+        </w:tc>
+      </w:tr>
+      <w:tr>
+        <w:tc>
+          <w:tcPr/>
+          <w:p>
+            <w:pPr>
+              <w:pStyle w:val="Compact"/>
+            </w:pPr>
+            <w:r>
+              <w:t xml:space="preserve">📅</w:t>
+            </w:r>
+          </w:p>
+        </w:tc>
+        <w:tc>
+          <w:tcPr/>
+          <w:p>
+            <w:pPr>
+              <w:pStyle w:val="Compact"/>
+            </w:pPr>
+            <w:r>
+              <w:t xml:space="preserve">Exercices</w:t>
+            </w:r>
+          </w:p>
+        </w:tc>
+      </w:tr>
+      <w:tr>
+        <w:tc>
+          <w:tcPr/>
+          <w:p>
+            <w:pPr>
+              <w:pStyle w:val="Compact"/>
+            </w:pPr>
+            <w:r>
+              <w:t xml:space="preserve">🗄️</w:t>
+            </w:r>
+          </w:p>
+        </w:tc>
+        <w:tc>
+          <w:tcPr/>
+          <w:p>
+            <w:pPr>
+              <w:pStyle w:val="Compact"/>
+            </w:pPr>
+            <w:r>
+              <w:t xml:space="preserve">Archives</w:t>
+            </w:r>
+          </w:p>
+        </w:tc>
+      </w:tr>
       <w:tr>
         <w:tc>
           <w:tcPr/>
@@ -1558,127 +1945,15 @@
           </w:p>
         </w:tc>
       </w:tr>
-      <w:tr>
-        <w:tc>
-          <w:tcPr/>
-          <w:p>
-            <w:pPr>
-              <w:pStyle w:val="Compact"/>
-            </w:pPr>
-            <w:r>
-              <w:t xml:space="preserve">📑</w:t>
-            </w:r>
-          </w:p>
-        </w:tc>
-        <w:tc>
-          <w:tcPr/>
-          <w:p>
-            <w:pPr>
-              <w:pStyle w:val="Compact"/>
-            </w:pPr>
-            <w:r>
-              <w:t xml:space="preserve">Déclaration TVA</w:t>
-            </w:r>
-          </w:p>
-        </w:tc>
-      </w:tr>
-      <w:tr>
-        <w:tc>
-          <w:tcPr/>
-          <w:p>
-            <w:pPr>
-              <w:pStyle w:val="Compact"/>
-            </w:pPr>
-            <w:r>
-              <w:t xml:space="preserve">📅</w:t>
-            </w:r>
-          </w:p>
-        </w:tc>
-        <w:tc>
-          <w:tcPr/>
-          <w:p>
-            <w:pPr>
-              <w:pStyle w:val="Compact"/>
-            </w:pPr>
-            <w:r>
-              <w:t xml:space="preserve">Exercices</w:t>
-            </w:r>
-          </w:p>
-        </w:tc>
-      </w:tr>
-      <w:tr>
-        <w:tc>
-          <w:tcPr/>
-          <w:p>
-            <w:pPr>
-              <w:pStyle w:val="Compact"/>
-            </w:pPr>
-            <w:r>
-              <w:t xml:space="preserve">🗄️</w:t>
-            </w:r>
-          </w:p>
-        </w:tc>
-        <w:tc>
-          <w:tcPr/>
-          <w:p>
-            <w:pPr>
-              <w:pStyle w:val="Compact"/>
-            </w:pPr>
-            <w:r>
-              <w:t xml:space="preserve">Archives</w:t>
-            </w:r>
-          </w:p>
-        </w:tc>
-      </w:tr>
-      <w:tr>
-        <w:tc>
-          <w:tcPr/>
-          <w:p>
-            <w:pPr>
-              <w:pStyle w:val="Compact"/>
-            </w:pPr>
-            <w:r>
-              <w:t xml:space="preserve">⚖️</w:t>
-            </w:r>
-          </w:p>
-        </w:tc>
-        <w:tc>
-          <w:tcPr/>
-          <w:p>
-            <w:pPr>
-              <w:pStyle w:val="Compact"/>
-            </w:pPr>
-            <w:r>
-              <w:t xml:space="preserve">Lettrage</w:t>
-            </w:r>
-          </w:p>
-        </w:tc>
-      </w:tr>
-      <w:tr>
-        <w:tc>
-          <w:tcPr/>
-          <w:p>
-            <w:pPr>
-              <w:pStyle w:val="Compact"/>
-            </w:pPr>
-            <w:r>
-              <w:t xml:space="preserve">⚙️</w:t>
-            </w:r>
-          </w:p>
-        </w:tc>
-        <w:tc>
-          <w:tcPr/>
-          <w:p>
-            <w:pPr>
-              <w:pStyle w:val="Compact"/>
-            </w:pPr>
-            <w:r>
-              <w:t xml:space="preserve">Paramètres</w:t>
-            </w:r>
-          </w:p>
-        </w:tc>
-      </w:tr>
     </w:tbl>
+    <w:p>
+      <w:pPr>
+        <w:pStyle w:val="BlockText"/>
+      </w:pPr>
+      <w:r>
+        <w:t xml:space="preserve">Ce regroupement par catégories simplifie la navigation : seules les rubriques de la catégorie ouverte sont affichées, ce qui réduit l’encombrement de la barre latérale au quotidien.</w:t>
+      </w:r>
+    </w:p>
     <w:bookmarkEnd w:id="31"/>
     <w:bookmarkStart w:id="32" w:name="onglets-de-travail"/>
     <w:p>

</xml_diff>

<commit_message>
feat: tests E2E autonomes, envoi/facturation commandes fournisseurs, filtres statut
- tests/e2e-utils.ts + global-setup/global-teardown : suite Playwright avec
  utilisateur dedie e2e@facturpro.test (independant du compte admin)
- 4 specs durables : smoke, achats, editeur, filtres (7/7 OK)
- Envoi du bon de commande au fournisseur par email (EmailService.envoyerCommande)
- Facturation d'une commande en un clic, editeur pre-rempli + chainage auto
- Filtre de statut sur acomptes et bons de livraison ; recherche globale
  etendue aux commandes/factures fournisseurs (search.ts)
- Manuel utilisateur a jour (sous-champs au survol, filtres, envoi, facturation)

Co-Authored-By: Claude Sonnet 4.6 <noreply@anthropic.com>
</commit_message>
<xml_diff>
--- a/docs/manuel-utilisateur.docx
+++ b/docs/manuel-utilisateur.docx
@@ -8652,7 +8652,7 @@
     </w:p>
     <w:bookmarkEnd w:id="85"/>
     <w:bookmarkEnd w:id="86"/>
-    <w:bookmarkStart w:id="104" w:name="éditeur-de-documents-wysiwyg"/>
+    <w:bookmarkStart w:id="105" w:name="éditeur-de-documents-wysiwyg"/>
     <w:p>
       <w:pPr>
         <w:pStyle w:val="Heading1"/>
@@ -8812,7 +8812,7 @@
       </w:r>
     </w:p>
     <w:bookmarkEnd w:id="94"/>
-    <w:bookmarkStart w:id="97" w:name="saisie-des-lignes"/>
+    <w:bookmarkStart w:id="98" w:name="saisie-des-lignes"/>
     <w:p>
       <w:pPr>
         <w:pStyle w:val="Heading2"/>
@@ -9036,12 +9036,88 @@
         <w:t xml:space="preserve">Les totaux (HT, TVA par taux, TTC) sont recalculés en temps réel.</w:t>
       </w:r>
     </w:p>
-    <w:bookmarkStart w:id="95" w:name="insérer-un-article-du-catalogue"/>
+    <w:bookmarkStart w:id="95" w:name="X773deac604e5e4a0f78f51d3900e53763b998b6"/>
     <w:p>
       <w:pPr>
         <w:pStyle w:val="Heading3"/>
       </w:pPr>
       <w:r>
+        <w:t xml:space="preserve">Champ Description masqué au survol (v3.2.10)</w:t>
+      </w:r>
+    </w:p>
+    <w:p>
+      <w:pPr>
+        <w:pStyle w:val="FirstParagraph"/>
+      </w:pPr>
+      <w:r>
+        <w:t xml:space="preserve">Pour alléger l’affichage, le champ</w:t>
+      </w:r>
+      <w:r>
+        <w:t xml:space="preserve"> </w:t>
+      </w:r>
+      <w:r>
+        <w:rPr>
+          <w:b/>
+          <w:bCs/>
+        </w:rPr>
+        <w:t xml:space="preserve">Description</w:t>
+      </w:r>
+      <w:r>
+        <w:t xml:space="preserve"> </w:t>
+      </w:r>
+      <w:r>
+        <w:t xml:space="preserve">d’une ligne reste</w:t>
+      </w:r>
+      <w:r>
+        <w:t xml:space="preserve"> </w:t>
+      </w:r>
+      <w:r>
+        <w:rPr>
+          <w:b/>
+          <w:bCs/>
+        </w:rPr>
+        <w:t xml:space="preserve">masqué tant qu’il est vide</w:t>
+      </w:r>
+      <w:r>
+        <w:t xml:space="preserve">. Il</w:t>
+      </w:r>
+      <w:r>
+        <w:t xml:space="preserve"> </w:t>
+      </w:r>
+      <w:r>
+        <w:rPr>
+          <w:b/>
+          <w:bCs/>
+        </w:rPr>
+        <w:t xml:space="preserve">apparaît au survol de la ligne</w:t>
+      </w:r>
+      <w:r>
+        <w:t xml:space="preserve"> </w:t>
+      </w:r>
+      <w:r>
+        <w:t xml:space="preserve">(ou lors de la saisie), pour permettre de le compléter sans encombrer la vue. Dès qu’une description est saisie, le champ</w:t>
+      </w:r>
+      <w:r>
+        <w:t xml:space="preserve"> </w:t>
+      </w:r>
+      <w:r>
+        <w:rPr>
+          <w:b/>
+          <w:bCs/>
+        </w:rPr>
+        <w:t xml:space="preserve">reste affiché en permanence</w:t>
+      </w:r>
+      <w:r>
+        <w:t xml:space="preserve">, même hors survol.</w:t>
+      </w:r>
+    </w:p>
+    <w:bookmarkEnd w:id="95"/>
+    <w:bookmarkStart w:id="96" w:name="insérer-un-article-du-catalogue"/>
+    <w:p>
+      <w:pPr>
+        <w:pStyle w:val="Heading3"/>
+      </w:pPr>
+      <w:r>
         <w:t xml:space="preserve">Insérer un article du catalogue</w:t>
       </w:r>
     </w:p>
@@ -9066,8 +9142,8 @@
         <w:t xml:space="preserve">, commencez à taper le nom — un menu de saisie semi-automatique filtre le catalogue. Cliquer sur un article pré-remplit désignation, description, prix et TVA.</w:t>
       </w:r>
     </w:p>
-    <w:bookmarkEnd w:id="95"/>
-    <w:bookmarkStart w:id="96" w:name="réordonner-les-lignes"/>
+    <w:bookmarkEnd w:id="96"/>
+    <w:bookmarkStart w:id="97" w:name="réordonner-les-lignes"/>
     <w:p>
       <w:pPr>
         <w:pStyle w:val="Heading3"/>
@@ -9100,9 +9176,9 @@
         <w:t xml:space="preserve">(icône ⠿ à gauche). Faites glisser la ligne à la position souhaitée — les totaux et les indicateurs de saut de page se recalculent automatiquement.</w:t>
       </w:r>
     </w:p>
-    <w:bookmarkEnd w:id="96"/>
     <w:bookmarkEnd w:id="97"/>
-    <w:bookmarkStart w:id="98" w:name="sélection-du-client"/>
+    <w:bookmarkEnd w:id="98"/>
+    <w:bookmarkStart w:id="99" w:name="sélection-du-client"/>
     <w:p>
       <w:pPr>
         <w:pStyle w:val="Heading2"/>
@@ -9151,8 +9227,8 @@
         <w:t xml:space="preserve">en bas de liste permet de créer un client à la volée.</w:t>
       </w:r>
     </w:p>
-    <w:bookmarkEnd w:id="98"/>
-    <w:bookmarkStart w:id="99" w:name="sauts-de-page"/>
+    <w:bookmarkEnd w:id="99"/>
+    <w:bookmarkStart w:id="100" w:name="sauts-de-page"/>
     <w:p>
       <w:pPr>
         <w:pStyle w:val="Heading2"/>
@@ -9197,8 +9273,8 @@
         <w:t xml:space="preserve">) aux mêmes endroits que dans le PDF généré. Ils se mettent à jour à chaque modification de ligne.</w:t>
       </w:r>
     </w:p>
-    <w:bookmarkEnd w:id="99"/>
-    <w:bookmarkStart w:id="103" w:name="nouveaux-champs-sur-les-factures-v2.13.0"/>
+    <w:bookmarkEnd w:id="100"/>
+    <w:bookmarkStart w:id="104" w:name="nouveaux-champs-sur-les-factures-v2.13.0"/>
     <w:p>
       <w:pPr>
         <w:pStyle w:val="Heading2"/>
@@ -9216,18 +9292,18 @@
           <wp:inline>
             <wp:extent cx="5334000" cy="2637413"/>
             <wp:effectExtent b="0" l="0" r="0" t="0"/>
-            <wp:docPr descr="Champs mentions légales sur la facture" title="" id="101" name="Picture"/>
+            <wp:docPr descr="Champs mentions légales sur la facture" title="" id="102" name="Picture"/>
             <a:graphic>
               <a:graphicData uri="http://schemas.openxmlformats.org/drawingml/2006/picture">
                 <pic:pic>
                   <pic:nvPicPr>
-                    <pic:cNvPr descr="screenshots/17-facture-mentions-legales.png" id="102" name="Picture"/>
+                    <pic:cNvPr descr="screenshots/17-facture-mentions-legales.png" id="103" name="Picture"/>
                     <pic:cNvPicPr>
                       <a:picLocks noChangeArrowheads="1" noChangeAspect="1"/>
                     </pic:cNvPicPr>
                   </pic:nvPicPr>
                   <pic:blipFill>
-                    <a:blip r:embed="rId100"/>
+                    <a:blip r:embed="rId101"/>
                     <a:stretch>
                       <a:fillRect/>
                     </a:stretch>
@@ -9437,9 +9513,9 @@
         </w:pict>
       </w:r>
     </w:p>
-    <w:bookmarkEnd w:id="103"/>
     <w:bookmarkEnd w:id="104"/>
-    <w:bookmarkStart w:id="117" w:name="devis-1"/>
+    <w:bookmarkEnd w:id="105"/>
+    <w:bookmarkStart w:id="118" w:name="devis-1"/>
     <w:p>
       <w:pPr>
         <w:pStyle w:val="Heading1"/>
@@ -9457,18 +9533,18 @@
           <wp:inline>
             <wp:extent cx="5334000" cy="2637413"/>
             <wp:effectExtent b="0" l="0" r="0" t="0"/>
-            <wp:docPr descr="Liste des devis" title="" id="106" name="Picture"/>
+            <wp:docPr descr="Liste des devis" title="" id="107" name="Picture"/>
             <a:graphic>
               <a:graphicData uri="http://schemas.openxmlformats.org/drawingml/2006/picture">
                 <pic:pic>
                   <pic:nvPicPr>
-                    <pic:cNvPr descr="screenshots/07-devis-liste.png" id="107" name="Picture"/>
+                    <pic:cNvPr descr="screenshots/07-devis-liste.png" id="108" name="Picture"/>
                     <pic:cNvPicPr>
                       <a:picLocks noChangeArrowheads="1" noChangeAspect="1"/>
                     </pic:cNvPicPr>
                   </pic:nvPicPr>
                   <pic:blipFill>
-                    <a:blip r:embed="rId105"/>
+                    <a:blip r:embed="rId106"/>
                     <a:stretch>
                       <a:fillRect/>
                     </a:stretch>
@@ -9503,7 +9579,7 @@
         <w:t xml:space="preserve">Liste des devis</w:t>
       </w:r>
     </w:p>
-    <w:bookmarkStart w:id="108" w:name="cycle-de-vie"/>
+    <w:bookmarkStart w:id="109" w:name="cycle-de-vie"/>
     <w:p>
       <w:pPr>
         <w:pStyle w:val="Heading2"/>
@@ -9550,8 +9626,8 @@
         <w:t xml:space="preserve">                └──► Refusé</w:t>
       </w:r>
     </w:p>
-    <w:bookmarkEnd w:id="108"/>
-    <w:bookmarkStart w:id="109" w:name="créer-un-devis"/>
+    <w:bookmarkEnd w:id="109"/>
+    <w:bookmarkStart w:id="110" w:name="créer-un-devis"/>
     <w:p>
       <w:pPr>
         <w:pStyle w:val="Heading2"/>
@@ -9734,8 +9810,8 @@
         <w:t xml:space="preserve">est cochée par défaut — décochez-la pour activer la tarification.</w:t>
       </w:r>
     </w:p>
-    <w:bookmarkEnd w:id="109"/>
-    <w:bookmarkStart w:id="110" w:name="envoyer-un-devis"/>
+    <w:bookmarkEnd w:id="110"/>
+    <w:bookmarkStart w:id="111" w:name="envoyer-un-devis"/>
     <w:p>
       <w:pPr>
         <w:pStyle w:val="Heading2"/>
@@ -9804,8 +9880,8 @@
         <w:t xml:space="preserve">Si un email client est renseigné, propose l’envoi par email avec le PDF joint.</w:t>
       </w:r>
     </w:p>
-    <w:bookmarkEnd w:id="110"/>
-    <w:bookmarkStart w:id="111" w:name="accepter-un-devis"/>
+    <w:bookmarkEnd w:id="111"/>
+    <w:bookmarkStart w:id="112" w:name="accepter-un-devis"/>
     <w:p>
       <w:pPr>
         <w:pStyle w:val="Heading2"/>
@@ -9947,8 +10023,8 @@
         <w:t xml:space="preserve">apparaissent dans la barre.</w:t>
       </w:r>
     </w:p>
-    <w:bookmarkEnd w:id="111"/>
-    <w:bookmarkStart w:id="112" w:name="signature-électronique-v2.13.0"/>
+    <w:bookmarkEnd w:id="112"/>
+    <w:bookmarkStart w:id="113" w:name="signature-électronique-v2.13.0"/>
     <w:p>
       <w:pPr>
         <w:pStyle w:val="Heading2"/>
@@ -10094,8 +10170,8 @@
         <w:t xml:space="preserve">“Ce devis a déjà été signé le…”</w:t>
       </w:r>
     </w:p>
-    <w:bookmarkEnd w:id="112"/>
-    <w:bookmarkStart w:id="113" w:name="dupliquer"/>
+    <w:bookmarkEnd w:id="113"/>
+    <w:bookmarkStart w:id="114" w:name="dupliquer"/>
     <w:p>
       <w:pPr>
         <w:pStyle w:val="Heading2"/>
@@ -10143,8 +10219,8 @@
         <w:t xml:space="preserve">avec les mêmes lignes — idéal pour créer des variantes.</w:t>
       </w:r>
     </w:p>
-    <w:bookmarkEnd w:id="113"/>
-    <w:bookmarkStart w:id="114" w:name="convertir-en-bon-de-livraison"/>
+    <w:bookmarkEnd w:id="114"/>
+    <w:bookmarkStart w:id="115" w:name="convertir-en-bon-de-livraison"/>
     <w:p>
       <w:pPr>
         <w:pStyle w:val="Heading2"/>
@@ -10177,8 +10253,8 @@
         <w:t xml:space="preserve">→ BL pré-rempli avec les lignes du devis.</w:t>
       </w:r>
     </w:p>
-    <w:bookmarkEnd w:id="114"/>
-    <w:bookmarkStart w:id="115" w:name="convertir-en-facture"/>
+    <w:bookmarkEnd w:id="115"/>
+    <w:bookmarkStart w:id="116" w:name="convertir-en-facture"/>
     <w:p>
       <w:pPr>
         <w:pStyle w:val="Heading2"/>
@@ -10211,8 +10287,8 @@
         <w:t xml:space="preserve">→ facture pré-remplie.</w:t>
       </w:r>
     </w:p>
-    <w:bookmarkEnd w:id="115"/>
-    <w:bookmarkStart w:id="116" w:name="télécharger-le-pdf"/>
+    <w:bookmarkEnd w:id="116"/>
+    <w:bookmarkStart w:id="117" w:name="télécharger-le-pdf"/>
     <w:p>
       <w:pPr>
         <w:pStyle w:val="Heading2"/>
@@ -10252,9 +10328,9 @@
         </w:pict>
       </w:r>
     </w:p>
-    <w:bookmarkEnd w:id="116"/>
     <w:bookmarkEnd w:id="117"/>
-    <w:bookmarkStart w:id="119" w:name="avenants"/>
+    <w:bookmarkEnd w:id="118"/>
+    <w:bookmarkStart w:id="120" w:name="avenants"/>
     <w:p>
       <w:pPr>
         <w:pStyle w:val="Heading1"/>
@@ -10271,7 +10347,7 @@
         <w:t xml:space="preserve">Un avenant modifie un devis accepté sans altérer l’original.</w:t>
       </w:r>
     </w:p>
-    <w:bookmarkStart w:id="118" w:name="créer-un-avenant"/>
+    <w:bookmarkStart w:id="119" w:name="créer-un-avenant"/>
     <w:p>
       <w:pPr>
         <w:pStyle w:val="Heading2"/>
@@ -10439,9 +10515,9 @@
         </w:pict>
       </w:r>
     </w:p>
-    <w:bookmarkEnd w:id="118"/>
     <w:bookmarkEnd w:id="119"/>
-    <w:bookmarkStart w:id="132" w:name="factures-1"/>
+    <w:bookmarkEnd w:id="120"/>
+    <w:bookmarkStart w:id="133" w:name="factures-1"/>
     <w:p>
       <w:pPr>
         <w:pStyle w:val="Heading1"/>
@@ -10459,18 +10535,18 @@
           <wp:inline>
             <wp:extent cx="5334000" cy="2637413"/>
             <wp:effectExtent b="0" l="0" r="0" t="0"/>
-            <wp:docPr descr="Liste des factures" title="" id="121" name="Picture"/>
+            <wp:docPr descr="Liste des factures" title="" id="122" name="Picture"/>
             <a:graphic>
               <a:graphicData uri="http://schemas.openxmlformats.org/drawingml/2006/picture">
                 <pic:pic>
                   <pic:nvPicPr>
-                    <pic:cNvPr descr="screenshots/06-factures-liste.png" id="122" name="Picture"/>
+                    <pic:cNvPr descr="screenshots/06-factures-liste.png" id="123" name="Picture"/>
                     <pic:cNvPicPr>
                       <a:picLocks noChangeArrowheads="1" noChangeAspect="1"/>
                     </pic:cNvPicPr>
                   </pic:nvPicPr>
                   <pic:blipFill>
-                    <a:blip r:embed="rId120"/>
+                    <a:blip r:embed="rId121"/>
                     <a:stretch>
                       <a:fillRect/>
                     </a:stretch>
@@ -10505,7 +10581,7 @@
         <w:t xml:space="preserve">Liste des factures</w:t>
       </w:r>
     </w:p>
-    <w:bookmarkStart w:id="123" w:name="cycle-de-vie-1"/>
+    <w:bookmarkStart w:id="124" w:name="cycle-de-vie-1"/>
     <w:p>
       <w:pPr>
         <w:pStyle w:val="Heading2"/>
@@ -10546,8 +10622,8 @@
         <w:t xml:space="preserve">, la facture est verrouillée définitivement. Pour annuler, créez un avoir.</w:t>
       </w:r>
     </w:p>
-    <w:bookmarkEnd w:id="123"/>
-    <w:bookmarkStart w:id="125" w:name="créer-une-facture"/>
+    <w:bookmarkEnd w:id="124"/>
+    <w:bookmarkStart w:id="126" w:name="créer-une-facture"/>
     <w:p>
       <w:pPr>
         <w:pStyle w:val="Heading2"/>
@@ -10597,7 +10673,7 @@
         <w:t xml:space="preserve">.</w:t>
       </w:r>
     </w:p>
-    <w:bookmarkStart w:id="124" w:name="mentions-légales-obligatoires"/>
+    <w:bookmarkStart w:id="125" w:name="mentions-légales-obligatoires"/>
     <w:p>
       <w:pPr>
         <w:pStyle w:val="Heading3"/>
@@ -10879,9 +10955,9 @@
         <w:t xml:space="preserve">Indemnité forfaitaire de recouvrement : 40 € (art. L441-10 C.com.)</w:t>
       </w:r>
     </w:p>
-    <w:bookmarkEnd w:id="124"/>
     <w:bookmarkEnd w:id="125"/>
-    <w:bookmarkStart w:id="126" w:name="émettre-une-facture"/>
+    <w:bookmarkEnd w:id="126"/>
+    <w:bookmarkStart w:id="127" w:name="émettre-une-facture"/>
     <w:p>
       <w:pPr>
         <w:pStyle w:val="Heading2"/>
@@ -11022,8 +11098,8 @@
         <w:t xml:space="preserve">Archive un snapshot JSON du document (conservation 10 ans).</w:t>
       </w:r>
     </w:p>
-    <w:bookmarkEnd w:id="126"/>
-    <w:bookmarkStart w:id="128" w:name="marquer-comme-payée"/>
+    <w:bookmarkEnd w:id="127"/>
+    <w:bookmarkStart w:id="129" w:name="marquer-comme-payée"/>
     <w:p>
       <w:pPr>
         <w:pStyle w:val="Heading2"/>
@@ -11080,7 +11156,7 @@
         <w:t xml:space="preserve">Lettrage automatique des lignes 411 de l’émission et du règlement</w:t>
       </w:r>
     </w:p>
-    <w:bookmarkStart w:id="127" w:name="déduire-un-acompte-lors-du-paiement"/>
+    <w:bookmarkStart w:id="128" w:name="déduire-un-acompte-lors-du-paiement"/>
     <w:p>
       <w:pPr>
         <w:pStyle w:val="Heading3"/>
@@ -11272,9 +11348,9 @@
         <w:t xml:space="preserve">: montant restant dû (ou 0,00 €)</w:t>
       </w:r>
     </w:p>
-    <w:bookmarkEnd w:id="127"/>
     <w:bookmarkEnd w:id="128"/>
-    <w:bookmarkStart w:id="129" w:name="envoyer-par-email"/>
+    <w:bookmarkEnd w:id="129"/>
+    <w:bookmarkStart w:id="130" w:name="envoyer-par-email"/>
     <w:p>
       <w:pPr>
         <w:pStyle w:val="Heading2"/>
@@ -11393,8 +11469,8 @@
         <w:t xml:space="preserve">: fichier email téléchargeable pour envoi depuis n’importe quel client mail.</w:t>
       </w:r>
     </w:p>
-    <w:bookmarkEnd w:id="129"/>
-    <w:bookmarkStart w:id="130" w:name="envoi-groupé"/>
+    <w:bookmarkEnd w:id="130"/>
+    <w:bookmarkStart w:id="131" w:name="envoi-groupé"/>
     <w:p>
       <w:pPr>
         <w:pStyle w:val="Heading2"/>
@@ -11439,8 +11515,8 @@
         <w:t xml:space="preserve">dans la barre d’outils — un email est envoyé à chaque client avec sa facture.</w:t>
       </w:r>
     </w:p>
-    <w:bookmarkEnd w:id="130"/>
-    <w:bookmarkStart w:id="131" w:name="dépôt-chorus-pro-e-invoicing-2026"/>
+    <w:bookmarkEnd w:id="131"/>
+    <w:bookmarkStart w:id="132" w:name="dépôt-chorus-pro-e-invoicing-2026"/>
     <w:p>
       <w:pPr>
         <w:pStyle w:val="Heading2"/>
@@ -11563,9 +11639,9 @@
         </w:pict>
       </w:r>
     </w:p>
-    <w:bookmarkEnd w:id="131"/>
     <w:bookmarkEnd w:id="132"/>
-    <w:bookmarkStart w:id="135" w:name="avoirs-factures-davoir"/>
+    <w:bookmarkEnd w:id="133"/>
+    <w:bookmarkStart w:id="136" w:name="avoirs-factures-davoir"/>
     <w:p>
       <w:pPr>
         <w:pStyle w:val="Heading1"/>
@@ -11574,7 +11650,7 @@
         <w:t xml:space="preserve">Avoirs (Factures d’avoir)</w:t>
       </w:r>
     </w:p>
-    <w:bookmarkStart w:id="133" w:name="créer-un-avoir"/>
+    <w:bookmarkStart w:id="134" w:name="créer-un-avoir"/>
     <w:p>
       <w:pPr>
         <w:pStyle w:val="Heading2"/>
@@ -11794,8 +11870,8 @@
         </w:tc>
       </w:tr>
     </w:tbl>
-    <w:bookmarkEnd w:id="133"/>
-    <w:bookmarkStart w:id="134" w:name="plafonnement"/>
+    <w:bookmarkEnd w:id="134"/>
+    <w:bookmarkStart w:id="135" w:name="plafonnement"/>
     <w:p>
       <w:pPr>
         <w:pStyle w:val="Heading2"/>
@@ -11832,9 +11908,9 @@
         </w:pict>
       </w:r>
     </w:p>
-    <w:bookmarkEnd w:id="134"/>
     <w:bookmarkEnd w:id="135"/>
-    <w:bookmarkStart w:id="141" w:name="acomptes"/>
+    <w:bookmarkEnd w:id="136"/>
+    <w:bookmarkStart w:id="143" w:name="acomptes"/>
     <w:p>
       <w:pPr>
         <w:pStyle w:val="Heading1"/>
@@ -11851,7 +11927,7 @@
         <w:t xml:space="preserve">Les acomptes permettent de facturer une partie du montant avant livraison. Ils sont scellés et archivés comme les factures.</w:t>
       </w:r>
     </w:p>
-    <w:bookmarkStart w:id="136" w:name="créer-un-acompte"/>
+    <w:bookmarkStart w:id="137" w:name="créer-un-acompte"/>
     <w:p>
       <w:pPr>
         <w:pStyle w:val="Heading2"/>
@@ -12011,8 +12087,8 @@
         <w:t xml:space="preserve">.</w:t>
       </w:r>
     </w:p>
-    <w:bookmarkEnd w:id="136"/>
-    <w:bookmarkStart w:id="137" w:name="encaisser"/>
+    <w:bookmarkEnd w:id="137"/>
+    <w:bookmarkStart w:id="138" w:name="encaisser"/>
     <w:p>
       <w:pPr>
         <w:pStyle w:val="Heading2"/>
@@ -12045,8 +12121,8 @@
         <w:t xml:space="preserve">→ saisir la date et le mode de paiement → l’acompte est verrouillé et son PDF généré.</w:t>
       </w:r>
     </w:p>
-    <w:bookmarkEnd w:id="137"/>
-    <w:bookmarkStart w:id="138" w:name="imputer-un-acompte-sur-une-facture"/>
+    <w:bookmarkEnd w:id="138"/>
+    <w:bookmarkStart w:id="139" w:name="imputer-un-acompte-sur-une-facture"/>
     <w:p>
       <w:pPr>
         <w:pStyle w:val="Heading2"/>
@@ -12077,8 +12153,8 @@
         <w:t xml:space="preserve">).</w:t>
       </w:r>
     </w:p>
-    <w:bookmarkEnd w:id="138"/>
-    <w:bookmarkStart w:id="139" w:name="reliquat-automatique"/>
+    <w:bookmarkEnd w:id="139"/>
+    <w:bookmarkStart w:id="140" w:name="reliquat-automatique"/>
     <w:p>
       <w:pPr>
         <w:pStyle w:val="Heading2"/>
@@ -12126,8 +12202,65 @@
         <w:t xml:space="preserve">et peut être utilisé sur une facture suivante.</w:t>
       </w:r>
     </w:p>
-    <w:bookmarkEnd w:id="139"/>
-    <w:bookmarkStart w:id="140" w:name="suivi-dans-la-liste"/>
+    <w:bookmarkEnd w:id="140"/>
+    <w:bookmarkStart w:id="141" w:name="filtrer-par-statut-v3.2.10"/>
+    <w:p>
+      <w:pPr>
+        <w:pStyle w:val="Heading2"/>
+      </w:pPr>
+      <w:r>
+        <w:t xml:space="preserve">Filtrer par statut (v3.2.10)</w:t>
+      </w:r>
+    </w:p>
+    <w:p>
+      <w:pPr>
+        <w:pStyle w:val="FirstParagraph"/>
+      </w:pPr>
+      <w:r>
+        <w:t xml:space="preserve">Le sélecteur en haut de la liste filtre les acomptes par statut :</w:t>
+      </w:r>
+      <w:r>
+        <w:t xml:space="preserve"> </w:t>
+      </w:r>
+      <w:r>
+        <w:rPr>
+          <w:b/>
+          <w:bCs/>
+        </w:rPr>
+        <w:t xml:space="preserve">Tous les statuts</w:t>
+      </w:r>
+      <w:r>
+        <w:t xml:space="preserve">,</w:t>
+      </w:r>
+      <w:r>
+        <w:t xml:space="preserve"> </w:t>
+      </w:r>
+      <w:r>
+        <w:rPr>
+          <w:b/>
+          <w:bCs/>
+        </w:rPr>
+        <w:t xml:space="preserve">En attente</w:t>
+      </w:r>
+      <w:r>
+        <w:t xml:space="preserve">,</w:t>
+      </w:r>
+      <w:r>
+        <w:t xml:space="preserve"> </w:t>
+      </w:r>
+      <w:r>
+        <w:rPr>
+          <w:b/>
+          <w:bCs/>
+        </w:rPr>
+        <w:t xml:space="preserve">Encaissé</w:t>
+      </w:r>
+      <w:r>
+        <w:t xml:space="preserve">.</w:t>
+      </w:r>
+    </w:p>
+    <w:bookmarkEnd w:id="141"/>
+    <w:bookmarkStart w:id="142" w:name="suivi-dans-la-liste"/>
     <w:p>
       <w:pPr>
         <w:pStyle w:val="Heading2"/>
@@ -12295,9 +12428,9 @@
         </w:pict>
       </w:r>
     </w:p>
-    <w:bookmarkEnd w:id="140"/>
-    <w:bookmarkEnd w:id="141"/>
-    <w:bookmarkStart w:id="146" w:name="bons-de-livraison"/>
+    <w:bookmarkEnd w:id="142"/>
+    <w:bookmarkEnd w:id="143"/>
+    <w:bookmarkStart w:id="149" w:name="bons-de-livraison"/>
     <w:p>
       <w:pPr>
         <w:pStyle w:val="Heading1"/>
@@ -12314,7 +12447,77 @@
         <w:t xml:space="preserve">Les BL documentent la remise des biens ou la réalisation des prestations.</w:t>
       </w:r>
     </w:p>
-    <w:bookmarkStart w:id="142" w:name="créer-un-bl"/>
+    <w:bookmarkStart w:id="144" w:name="filtrer-par-statut-v3.2.10-1"/>
+    <w:p>
+      <w:pPr>
+        <w:pStyle w:val="Heading2"/>
+      </w:pPr>
+      <w:r>
+        <w:t xml:space="preserve">Filtrer par statut (v3.2.10)</w:t>
+      </w:r>
+    </w:p>
+    <w:p>
+      <w:pPr>
+        <w:pStyle w:val="FirstParagraph"/>
+      </w:pPr>
+      <w:r>
+        <w:t xml:space="preserve">Le sélecteur en haut de la liste filtre les BL par statut :</w:t>
+      </w:r>
+      <w:r>
+        <w:t xml:space="preserve"> </w:t>
+      </w:r>
+      <w:r>
+        <w:rPr>
+          <w:b/>
+          <w:bCs/>
+        </w:rPr>
+        <w:t xml:space="preserve">Tous les statuts</w:t>
+      </w:r>
+      <w:r>
+        <w:t xml:space="preserve">,</w:t>
+      </w:r>
+      <w:r>
+        <w:t xml:space="preserve"> </w:t>
+      </w:r>
+      <w:r>
+        <w:rPr>
+          <w:b/>
+          <w:bCs/>
+        </w:rPr>
+        <w:t xml:space="preserve">Brouillon</w:t>
+      </w:r>
+      <w:r>
+        <w:t xml:space="preserve">,</w:t>
+      </w:r>
+      <w:r>
+        <w:t xml:space="preserve"> </w:t>
+      </w:r>
+      <w:r>
+        <w:rPr>
+          <w:b/>
+          <w:bCs/>
+        </w:rPr>
+        <w:t xml:space="preserve">Émis</w:t>
+      </w:r>
+      <w:r>
+        <w:t xml:space="preserve">,</w:t>
+      </w:r>
+      <w:r>
+        <w:t xml:space="preserve"> </w:t>
+      </w:r>
+      <w:r>
+        <w:rPr>
+          <w:b/>
+          <w:bCs/>
+        </w:rPr>
+        <w:t xml:space="preserve">Livré</w:t>
+      </w:r>
+      <w:r>
+        <w:t xml:space="preserve">.</w:t>
+      </w:r>
+    </w:p>
+    <w:bookmarkEnd w:id="144"/>
+    <w:bookmarkStart w:id="145" w:name="créer-un-bl"/>
     <w:p>
       <w:pPr>
         <w:pStyle w:val="Heading2"/>
@@ -12434,8 +12637,8 @@
         </w:tc>
       </w:tr>
     </w:tbl>
-    <w:bookmarkEnd w:id="142"/>
-    <w:bookmarkStart w:id="145" w:name="créer-une-facture-depuis-un-bl"/>
+    <w:bookmarkEnd w:id="145"/>
+    <w:bookmarkStart w:id="148" w:name="créer-une-facture-depuis-un-bl"/>
     <w:p>
       <w:pPr>
         <w:pStyle w:val="Heading2"/>
@@ -12444,7 +12647,7 @@
         <w:t xml:space="preserve">Créer une facture depuis un BL</w:t>
       </w:r>
     </w:p>
-    <w:bookmarkStart w:id="143" w:name="depuis-un-seul-bl"/>
+    <w:bookmarkStart w:id="146" w:name="depuis-un-seul-bl"/>
     <w:p>
       <w:pPr>
         <w:pStyle w:val="Heading3"/>
@@ -12477,8 +12680,8 @@
         <w:t xml:space="preserve">sur la ligne du BL → facture pré-remplie avec le client et les lignes du BL.</w:t>
       </w:r>
     </w:p>
-    <w:bookmarkEnd w:id="143"/>
-    <w:bookmarkStart w:id="144" w:name="depuis-plusieurs-bl-facture-groupée"/>
+    <w:bookmarkEnd w:id="146"/>
+    <w:bookmarkStart w:id="147" w:name="depuis-plusieurs-bl-facture-groupée"/>
     <w:p>
       <w:pPr>
         <w:pStyle w:val="Heading3"/>
@@ -12578,10 +12781,10 @@
         </w:pict>
       </w:r>
     </w:p>
-    <w:bookmarkEnd w:id="144"/>
-    <w:bookmarkEnd w:id="145"/>
-    <w:bookmarkEnd w:id="146"/>
-    <w:bookmarkStart w:id="149" w:name="prélèvements-sepa"/>
+    <w:bookmarkEnd w:id="147"/>
+    <w:bookmarkEnd w:id="148"/>
+    <w:bookmarkEnd w:id="149"/>
+    <w:bookmarkStart w:id="152" w:name="prélèvements-sepa"/>
     <w:p>
       <w:pPr>
         <w:pStyle w:val="Heading1"/>
@@ -12598,7 +12801,7 @@
         <w:t xml:space="preserve">Génère des fichiers XML pain.008.001.02 importables dans votre interface bancaire.</w:t>
       </w:r>
     </w:p>
-    <w:bookmarkStart w:id="147" w:name="prérequis"/>
+    <w:bookmarkStart w:id="150" w:name="prérequis"/>
     <w:p>
       <w:pPr>
         <w:pStyle w:val="Heading2"/>
@@ -12651,8 +12854,8 @@
         <w:t xml:space="preserve">: IBAN, BIC, RUM, date de mandat dans la fiche client.</w:t>
       </w:r>
     </w:p>
-    <w:bookmarkEnd w:id="147"/>
-    <w:bookmarkStart w:id="148" w:name="générer-un-fichier-sepa"/>
+    <w:bookmarkEnd w:id="150"/>
+    <w:bookmarkStart w:id="151" w:name="générer-un-fichier-sepa"/>
     <w:p>
       <w:pPr>
         <w:pStyle w:val="Heading2"/>
@@ -12799,9 +13002,9 @@
         </w:pict>
       </w:r>
     </w:p>
-    <w:bookmarkEnd w:id="148"/>
-    <w:bookmarkEnd w:id="149"/>
-    <w:bookmarkStart w:id="172" w:name="X6b8f762b0e70895b422a1832195335854b0b65e"/>
+    <w:bookmarkEnd w:id="151"/>
+    <w:bookmarkEnd w:id="152"/>
+    <w:bookmarkStart w:id="177" w:name="X6b8f762b0e70895b422a1832195335854b0b65e"/>
     <w:p>
       <w:pPr>
         <w:pStyle w:val="Heading1"/>
@@ -12876,7 +13079,7 @@
         <w:t xml:space="preserve">.</w:t>
       </w:r>
     </w:p>
-    <w:bookmarkStart w:id="156" w:name="fournisseurs"/>
+    <w:bookmarkStart w:id="159" w:name="fournisseurs"/>
     <w:p>
       <w:pPr>
         <w:pStyle w:val="Heading2"/>
@@ -12894,109 +13097,12 @@
           <wp:inline>
             <wp:extent cx="5334000" cy="2637413"/>
             <wp:effectExtent b="0" l="0" r="0" t="0"/>
-            <wp:docPr descr="Liste des fournisseurs" title="" id="151" name="Picture"/>
+            <wp:docPr descr="Liste des fournisseurs" title="" id="154" name="Picture"/>
             <a:graphic>
               <a:graphicData uri="http://schemas.openxmlformats.org/drawingml/2006/picture">
                 <pic:pic>
                   <pic:nvPicPr>
-                    <pic:cNvPr descr="screenshots/20-fournisseurs-liste.png" id="152" name="Picture"/>
-                    <pic:cNvPicPr>
-                      <a:picLocks noChangeArrowheads="1" noChangeAspect="1"/>
-                    </pic:cNvPicPr>
-                  </pic:nvPicPr>
-                  <pic:blipFill>
-                    <a:blip r:embed="rId150"/>
-                    <a:stretch>
-                      <a:fillRect/>
-                    </a:stretch>
-                  </pic:blipFill>
-                  <pic:spPr bwMode="auto">
-                    <a:xfrm>
-                      <a:off x="0" y="0"/>
-                      <a:ext cx="5334000" cy="2637413"/>
-                    </a:xfrm>
-                    <a:prstGeom prst="rect">
-                      <a:avLst/>
-                    </a:prstGeom>
-                    <a:noFill/>
-                    <a:ln w="9525">
-                      <a:noFill/>
-                      <a:headEnd/>
-                      <a:tailEnd/>
-                    </a:ln>
-                  </pic:spPr>
-                </pic:pic>
-              </a:graphicData>
-            </a:graphic>
-          </wp:inline>
-        </w:drawing>
-      </w:r>
-    </w:p>
-    <w:p>
-      <w:pPr>
-        <w:pStyle w:val="ImageCaption"/>
-      </w:pPr>
-      <w:r>
-        <w:t xml:space="preserve">Liste des fournisseurs</w:t>
-      </w:r>
-    </w:p>
-    <w:p>
-      <w:pPr>
-        <w:pStyle w:val="BodyText"/>
-      </w:pPr>
-      <w:r>
-        <w:rPr>
-          <w:b/>
-          <w:bCs/>
-        </w:rPr>
-        <w:t xml:space="preserve">Achats &gt; Fournisseurs</w:t>
-      </w:r>
-      <w:r>
-        <w:t xml:space="preserve"> </w:t>
-      </w:r>
-      <w:r>
-        <w:t xml:space="preserve">liste l’ensemble de vos fournisseurs avec raison sociale, email, téléphone, SIRET et conditions de paiement.</w:t>
-      </w:r>
-    </w:p>
-    <w:p>
-      <w:pPr>
-        <w:pStyle w:val="BodyText"/>
-      </w:pPr>
-      <w:r>
-        <w:t xml:space="preserve">Bouton</w:t>
-      </w:r>
-      <w:r>
-        <w:t xml:space="preserve"> </w:t>
-      </w:r>
-      <w:r>
-        <w:rPr>
-          <w:b/>
-          <w:bCs/>
-        </w:rPr>
-        <w:t xml:space="preserve">+ Nouveau fournisseur</w:t>
-      </w:r>
-      <w:r>
-        <w:t xml:space="preserve"> </w:t>
-      </w:r>
-      <w:r>
-        <w:t xml:space="preserve">pour ouvrir la fiche de création :</w:t>
-      </w:r>
-    </w:p>
-    <w:p>
-      <w:pPr>
-        <w:pStyle w:val="CaptionedFigure"/>
-      </w:pPr>
-      <w:r>
-        <w:drawing>
-          <wp:inline>
-            <wp:extent cx="5334000" cy="2637413"/>
-            <wp:effectExtent b="0" l="0" r="0" t="0"/>
-            <wp:docPr descr="Fiche fournisseur" title="" id="154" name="Picture"/>
-            <a:graphic>
-              <a:graphicData uri="http://schemas.openxmlformats.org/drawingml/2006/picture">
-                <pic:pic>
-                  <pic:nvPicPr>
-                    <pic:cNvPr descr="screenshots/21-fournisseur-fiche.png" id="155" name="Picture"/>
+                    <pic:cNvPr descr="screenshots/20-fournisseurs-liste.png" id="155" name="Picture"/>
                     <pic:cNvPicPr>
                       <a:picLocks noChangeArrowheads="1" noChangeAspect="1"/>
                     </pic:cNvPicPr>
@@ -13034,274 +13140,49 @@
         <w:pStyle w:val="ImageCaption"/>
       </w:pPr>
       <w:r>
-        <w:t xml:space="preserve">Fiche fournisseur</w:t>
-      </w:r>
-    </w:p>
-    <w:tbl>
-      <w:tblPr>
-        <w:tblStyle w:val="Table"/>
-        <w:tblW w:type="pct" w:w="5000"/>
-        <w:tblLayout w:type="fixed"/>
-        <w:tblLook w:firstRow="1" w:lastRow="0" w:firstColumn="0" w:lastColumn="0" w:noHBand="0" w:noVBand="0" w:val="0020"/>
-      </w:tblPr>
-      <w:tblGrid>
-        <w:gridCol w:w="3960"/>
-        <w:gridCol w:w="3960"/>
-      </w:tblGrid>
-      <w:tr>
-        <w:trPr>
-          <w:tblHeader w:val="on"/>
-        </w:trPr>
-        <w:tc>
-          <w:tcPr/>
-          <w:p>
-            <w:pPr>
-              <w:pStyle w:val="Compact"/>
-            </w:pPr>
-            <w:r>
-              <w:t xml:space="preserve">Champ</w:t>
-            </w:r>
-          </w:p>
-        </w:tc>
-        <w:tc>
-          <w:tcPr/>
-          <w:p>
-            <w:pPr>
-              <w:pStyle w:val="Compact"/>
-            </w:pPr>
-            <w:r>
-              <w:t xml:space="preserve">Remarque</w:t>
-            </w:r>
-          </w:p>
-        </w:tc>
-      </w:tr>
-      <w:tr>
-        <w:tc>
-          <w:tcPr/>
-          <w:p>
-            <w:pPr>
-              <w:pStyle w:val="Compact"/>
-            </w:pPr>
-            <w:r>
-              <w:t xml:space="preserve">Raison sociale *</w:t>
-            </w:r>
-          </w:p>
-        </w:tc>
-        <w:tc>
-          <w:tcPr/>
-          <w:p>
-            <w:pPr>
-              <w:pStyle w:val="Compact"/>
-            </w:pPr>
-            <w:r>
-              <w:t xml:space="preserve">Obligatoire</w:t>
-            </w:r>
-          </w:p>
-        </w:tc>
-      </w:tr>
-      <w:tr>
-        <w:tc>
-          <w:tcPr/>
-          <w:p>
-            <w:pPr>
-              <w:pStyle w:val="Compact"/>
-            </w:pPr>
-            <w:r>
-              <w:t xml:space="preserve">Adresse / Complément / Code postal / Ville</w:t>
-            </w:r>
-          </w:p>
-        </w:tc>
-        <w:tc>
-          <w:tcPr/>
-          <w:p>
-            <w:pPr>
-              <w:pStyle w:val="Compact"/>
-            </w:pPr>
-            <w:r>
-              <w:t xml:space="preserve">Coordonnées postales</w:t>
-            </w:r>
-          </w:p>
-        </w:tc>
-      </w:tr>
-      <w:tr>
-        <w:tc>
-          <w:tcPr/>
-          <w:p>
-            <w:pPr>
-              <w:pStyle w:val="Compact"/>
-            </w:pPr>
-            <w:r>
-              <w:t xml:space="preserve">Email / Téléphone</w:t>
-            </w:r>
-          </w:p>
-        </w:tc>
-        <w:tc>
-          <w:tcPr/>
-          <w:p>
-            <w:pPr>
-              <w:pStyle w:val="Compact"/>
-            </w:pPr>
-            <w:r>
-              <w:t xml:space="preserve">Coordonnées de contact</w:t>
-            </w:r>
-          </w:p>
-        </w:tc>
-      </w:tr>
-      <w:tr>
-        <w:tc>
-          <w:tcPr/>
-          <w:p>
-            <w:pPr>
-              <w:pStyle w:val="Compact"/>
-            </w:pPr>
-            <w:r>
-              <w:t xml:space="preserve">SIRET / TVA Intracom</w:t>
-            </w:r>
-          </w:p>
-        </w:tc>
-        <w:tc>
-          <w:tcPr/>
-          <w:p>
-            <w:pPr>
-              <w:pStyle w:val="Compact"/>
-            </w:pPr>
-            <w:r>
-              <w:t xml:space="preserve">Identifiants légaux</w:t>
-            </w:r>
-          </w:p>
-        </w:tc>
-      </w:tr>
-      <w:tr>
-        <w:tc>
-          <w:tcPr/>
-          <w:p>
-            <w:pPr>
-              <w:pStyle w:val="Compact"/>
-            </w:pPr>
-            <w:r>
-              <w:t xml:space="preserve">Conditions de paiement</w:t>
-            </w:r>
-          </w:p>
-        </w:tc>
-        <w:tc>
-          <w:tcPr/>
-          <w:p>
-            <w:pPr>
-              <w:pStyle w:val="Compact"/>
-            </w:pPr>
-            <w:r>
-              <w:t xml:space="preserve">Texte libre, pour information uniquement</w:t>
-            </w:r>
-          </w:p>
-        </w:tc>
-      </w:tr>
-      <w:tr>
-        <w:tc>
-          <w:tcPr/>
-          <w:p>
-            <w:pPr>
-              <w:pStyle w:val="Compact"/>
-            </w:pPr>
-            <w:r>
-              <w:t xml:space="preserve">IBAN / BIC</w:t>
-            </w:r>
-          </w:p>
-        </w:tc>
-        <w:tc>
-          <w:tcPr/>
-          <w:p>
-            <w:pPr>
-              <w:pStyle w:val="Compact"/>
-            </w:pPr>
-            <w:r>
-              <w:t xml:space="preserve">Coordonnées bancaires pour vos virements, repliées dans</w:t>
-            </w:r>
-            <w:r>
-              <w:t xml:space="preserve"> </w:t>
-            </w:r>
-            <w:r>
-              <w:rPr>
-                <w:b/>
-                <w:bCs/>
-              </w:rPr>
-              <w:t xml:space="preserve">🏦 Coordonnées bancaires</w:t>
-            </w:r>
-          </w:p>
-        </w:tc>
-      </w:tr>
-      <w:tr>
-        <w:tc>
-          <w:tcPr/>
-          <w:p>
-            <w:pPr>
-              <w:pStyle w:val="Compact"/>
-            </w:pPr>
-            <w:r>
-              <w:t xml:space="preserve">Notes</w:t>
-            </w:r>
-          </w:p>
-        </w:tc>
-        <w:tc>
-          <w:tcPr/>
-          <w:p>
-            <w:pPr>
-              <w:pStyle w:val="Compact"/>
-            </w:pPr>
-            <w:r>
-              <w:t xml:space="preserve">Texte libre</w:t>
-            </w:r>
-          </w:p>
-        </w:tc>
-      </w:tr>
-    </w:tbl>
+        <w:t xml:space="preserve">Liste des fournisseurs</w:t>
+      </w:r>
+    </w:p>
     <w:p>
       <w:pPr>
         <w:pStyle w:val="BodyText"/>
       </w:pPr>
       <w:r>
-        <w:t xml:space="preserve">Les boutons</w:t>
-      </w:r>
-      <w:r>
-        <w:t xml:space="preserve"> </w:t>
-      </w:r>
-      <w:r>
-        <w:rPr>
-          <w:b/>
-          <w:bCs/>
-        </w:rPr>
-        <w:t xml:space="preserve">⬇ Exporter CSV</w:t>
-      </w:r>
-      <w:r>
-        <w:t xml:space="preserve"> </w:t>
-      </w:r>
-      <w:r>
-        <w:t xml:space="preserve">et</w:t>
-      </w:r>
-      <w:r>
-        <w:t xml:space="preserve"> </w:t>
-      </w:r>
-      <w:r>
-        <w:rPr>
-          <w:b/>
-          <w:bCs/>
-        </w:rPr>
-        <w:t xml:space="preserve">⬆ Importer CSV</w:t>
-      </w:r>
-      <w:r>
-        <w:t xml:space="preserve"> </w:t>
-      </w:r>
-      <w:r>
-        <w:t xml:space="preserve">permettent d’échanger votre liste de fournisseurs au format tableur.</w:t>
-      </w:r>
-    </w:p>
-    <w:bookmarkEnd w:id="156"/>
-    <w:bookmarkStart w:id="165" w:name="commandes-bons-de-commande"/>
-    <w:p>
-      <w:pPr>
-        <w:pStyle w:val="Heading2"/>
-      </w:pPr>
-      <w:r>
-        <w:t xml:space="preserve">Commandes (bons de commande)</w:t>
+        <w:rPr>
+          <w:b/>
+          <w:bCs/>
+        </w:rPr>
+        <w:t xml:space="preserve">Achats &gt; Fournisseurs</w:t>
+      </w:r>
+      <w:r>
+        <w:t xml:space="preserve"> </w:t>
+      </w:r>
+      <w:r>
+        <w:t xml:space="preserve">liste l’ensemble de vos fournisseurs avec raison sociale, email, téléphone, SIRET et conditions de paiement.</w:t>
+      </w:r>
+    </w:p>
+    <w:p>
+      <w:pPr>
+        <w:pStyle w:val="BodyText"/>
+      </w:pPr>
+      <w:r>
+        <w:t xml:space="preserve">Bouton</w:t>
+      </w:r>
+      <w:r>
+        <w:t xml:space="preserve"> </w:t>
+      </w:r>
+      <w:r>
+        <w:rPr>
+          <w:b/>
+          <w:bCs/>
+        </w:rPr>
+        <w:t xml:space="preserve">+ Nouveau fournisseur</w:t>
+      </w:r>
+      <w:r>
+        <w:t xml:space="preserve"> </w:t>
+      </w:r>
+      <w:r>
+        <w:t xml:space="preserve">pour ouvrir la fiche de création :</w:t>
       </w:r>
     </w:p>
     <w:p>
@@ -13313,18 +13194,18 @@
           <wp:inline>
             <wp:extent cx="5334000" cy="2637413"/>
             <wp:effectExtent b="0" l="0" r="0" t="0"/>
-            <wp:docPr descr="Liste des commandes" title="" id="158" name="Picture"/>
+            <wp:docPr descr="Fiche fournisseur" title="" id="157" name="Picture"/>
             <a:graphic>
               <a:graphicData uri="http://schemas.openxmlformats.org/drawingml/2006/picture">
                 <pic:pic>
                   <pic:nvPicPr>
-                    <pic:cNvPr descr="screenshots/22-commandes-liste.png" id="159" name="Picture"/>
+                    <pic:cNvPr descr="screenshots/21-fournisseur-fiche.png" id="158" name="Picture"/>
                     <pic:cNvPicPr>
                       <a:picLocks noChangeArrowheads="1" noChangeAspect="1"/>
                     </pic:cNvPicPr>
                   </pic:nvPicPr>
                   <pic:blipFill>
-                    <a:blip r:embed="rId157"/>
+                    <a:blip r:embed="rId156"/>
                     <a:stretch>
                       <a:fillRect/>
                     </a:stretch>
@@ -13356,107 +13237,274 @@
         <w:pStyle w:val="ImageCaption"/>
       </w:pPr>
       <w:r>
-        <w:t xml:space="preserve">Liste des commandes</w:t>
-      </w:r>
-    </w:p>
+        <w:t xml:space="preserve">Fiche fournisseur</w:t>
+      </w:r>
+    </w:p>
+    <w:tbl>
+      <w:tblPr>
+        <w:tblStyle w:val="Table"/>
+        <w:tblW w:type="pct" w:w="5000"/>
+        <w:tblLayout w:type="fixed"/>
+        <w:tblLook w:firstRow="1" w:lastRow="0" w:firstColumn="0" w:lastColumn="0" w:noHBand="0" w:noVBand="0" w:val="0020"/>
+      </w:tblPr>
+      <w:tblGrid>
+        <w:gridCol w:w="3960"/>
+        <w:gridCol w:w="3960"/>
+      </w:tblGrid>
+      <w:tr>
+        <w:trPr>
+          <w:tblHeader w:val="on"/>
+        </w:trPr>
+        <w:tc>
+          <w:tcPr/>
+          <w:p>
+            <w:pPr>
+              <w:pStyle w:val="Compact"/>
+            </w:pPr>
+            <w:r>
+              <w:t xml:space="preserve">Champ</w:t>
+            </w:r>
+          </w:p>
+        </w:tc>
+        <w:tc>
+          <w:tcPr/>
+          <w:p>
+            <w:pPr>
+              <w:pStyle w:val="Compact"/>
+            </w:pPr>
+            <w:r>
+              <w:t xml:space="preserve">Remarque</w:t>
+            </w:r>
+          </w:p>
+        </w:tc>
+      </w:tr>
+      <w:tr>
+        <w:tc>
+          <w:tcPr/>
+          <w:p>
+            <w:pPr>
+              <w:pStyle w:val="Compact"/>
+            </w:pPr>
+            <w:r>
+              <w:t xml:space="preserve">Raison sociale *</w:t>
+            </w:r>
+          </w:p>
+        </w:tc>
+        <w:tc>
+          <w:tcPr/>
+          <w:p>
+            <w:pPr>
+              <w:pStyle w:val="Compact"/>
+            </w:pPr>
+            <w:r>
+              <w:t xml:space="preserve">Obligatoire</w:t>
+            </w:r>
+          </w:p>
+        </w:tc>
+      </w:tr>
+      <w:tr>
+        <w:tc>
+          <w:tcPr/>
+          <w:p>
+            <w:pPr>
+              <w:pStyle w:val="Compact"/>
+            </w:pPr>
+            <w:r>
+              <w:t xml:space="preserve">Adresse / Complément / Code postal / Ville</w:t>
+            </w:r>
+          </w:p>
+        </w:tc>
+        <w:tc>
+          <w:tcPr/>
+          <w:p>
+            <w:pPr>
+              <w:pStyle w:val="Compact"/>
+            </w:pPr>
+            <w:r>
+              <w:t xml:space="preserve">Coordonnées postales</w:t>
+            </w:r>
+          </w:p>
+        </w:tc>
+      </w:tr>
+      <w:tr>
+        <w:tc>
+          <w:tcPr/>
+          <w:p>
+            <w:pPr>
+              <w:pStyle w:val="Compact"/>
+            </w:pPr>
+            <w:r>
+              <w:t xml:space="preserve">Email / Téléphone</w:t>
+            </w:r>
+          </w:p>
+        </w:tc>
+        <w:tc>
+          <w:tcPr/>
+          <w:p>
+            <w:pPr>
+              <w:pStyle w:val="Compact"/>
+            </w:pPr>
+            <w:r>
+              <w:t xml:space="preserve">Coordonnées de contact</w:t>
+            </w:r>
+          </w:p>
+        </w:tc>
+      </w:tr>
+      <w:tr>
+        <w:tc>
+          <w:tcPr/>
+          <w:p>
+            <w:pPr>
+              <w:pStyle w:val="Compact"/>
+            </w:pPr>
+            <w:r>
+              <w:t xml:space="preserve">SIRET / TVA Intracom</w:t>
+            </w:r>
+          </w:p>
+        </w:tc>
+        <w:tc>
+          <w:tcPr/>
+          <w:p>
+            <w:pPr>
+              <w:pStyle w:val="Compact"/>
+            </w:pPr>
+            <w:r>
+              <w:t xml:space="preserve">Identifiants légaux</w:t>
+            </w:r>
+          </w:p>
+        </w:tc>
+      </w:tr>
+      <w:tr>
+        <w:tc>
+          <w:tcPr/>
+          <w:p>
+            <w:pPr>
+              <w:pStyle w:val="Compact"/>
+            </w:pPr>
+            <w:r>
+              <w:t xml:space="preserve">Conditions de paiement</w:t>
+            </w:r>
+          </w:p>
+        </w:tc>
+        <w:tc>
+          <w:tcPr/>
+          <w:p>
+            <w:pPr>
+              <w:pStyle w:val="Compact"/>
+            </w:pPr>
+            <w:r>
+              <w:t xml:space="preserve">Texte libre, pour information uniquement</w:t>
+            </w:r>
+          </w:p>
+        </w:tc>
+      </w:tr>
+      <w:tr>
+        <w:tc>
+          <w:tcPr/>
+          <w:p>
+            <w:pPr>
+              <w:pStyle w:val="Compact"/>
+            </w:pPr>
+            <w:r>
+              <w:t xml:space="preserve">IBAN / BIC</w:t>
+            </w:r>
+          </w:p>
+        </w:tc>
+        <w:tc>
+          <w:tcPr/>
+          <w:p>
+            <w:pPr>
+              <w:pStyle w:val="Compact"/>
+            </w:pPr>
+            <w:r>
+              <w:t xml:space="preserve">Coordonnées bancaires pour vos virements, repliées dans</w:t>
+            </w:r>
+            <w:r>
+              <w:t xml:space="preserve"> </w:t>
+            </w:r>
+            <w:r>
+              <w:rPr>
+                <w:b/>
+                <w:bCs/>
+              </w:rPr>
+              <w:t xml:space="preserve">🏦 Coordonnées bancaires</w:t>
+            </w:r>
+          </w:p>
+        </w:tc>
+      </w:tr>
+      <w:tr>
+        <w:tc>
+          <w:tcPr/>
+          <w:p>
+            <w:pPr>
+              <w:pStyle w:val="Compact"/>
+            </w:pPr>
+            <w:r>
+              <w:t xml:space="preserve">Notes</w:t>
+            </w:r>
+          </w:p>
+        </w:tc>
+        <w:tc>
+          <w:tcPr/>
+          <w:p>
+            <w:pPr>
+              <w:pStyle w:val="Compact"/>
+            </w:pPr>
+            <w:r>
+              <w:t xml:space="preserve">Texte libre</w:t>
+            </w:r>
+          </w:p>
+        </w:tc>
+      </w:tr>
+    </w:tbl>
     <w:p>
       <w:pPr>
         <w:pStyle w:val="BodyText"/>
       </w:pPr>
       <w:r>
-        <w:rPr>
-          <w:b/>
-          <w:bCs/>
-        </w:rPr>
-        <w:t xml:space="preserve">Achats &gt; Commandes</w:t>
-      </w:r>
-      <w:r>
-        <w:t xml:space="preserve"> </w:t>
-      </w:r>
-      <w:r>
-        <w:t xml:space="preserve">liste les bons de commande passés auprès de vos fournisseurs, filtrables par statut (</w:t>
-      </w:r>
-      <w:r>
-        <w:rPr>
-          <w:b/>
-          <w:bCs/>
-        </w:rPr>
-        <w:t xml:space="preserve">Toutes</w:t>
-      </w:r>
-      <w:r>
-        <w:t xml:space="preserve">,</w:t>
-      </w:r>
-      <w:r>
-        <w:t xml:space="preserve"> </w:t>
-      </w:r>
-      <w:r>
-        <w:rPr>
-          <w:b/>
-          <w:bCs/>
-        </w:rPr>
-        <w:t xml:space="preserve">En cours</w:t>
-      </w:r>
-      <w:r>
-        <w:t xml:space="preserve">,</w:t>
-      </w:r>
-      <w:r>
-        <w:t xml:space="preserve"> </w:t>
-      </w:r>
-      <w:r>
-        <w:rPr>
-          <w:b/>
-          <w:bCs/>
-        </w:rPr>
-        <w:t xml:space="preserve">Réceptionnées</w:t>
-      </w:r>
-      <w:r>
-        <w:t xml:space="preserve">,</w:t>
-      </w:r>
-      <w:r>
-        <w:t xml:space="preserve"> </w:t>
-      </w:r>
-      <w:r>
-        <w:rPr>
-          <w:b/>
-          <w:bCs/>
-        </w:rPr>
-        <w:t xml:space="preserve">Annulées</w:t>
-      </w:r>
-      <w:r>
-        <w:t xml:space="preserve">).</w:t>
-      </w:r>
-    </w:p>
-    <w:bookmarkStart w:id="163" w:name="éditeur-de-bon-de-commande-v3.2.8"/>
-    <w:p>
-      <w:pPr>
-        <w:pStyle w:val="Heading3"/>
-      </w:pPr>
-      <w:r>
-        <w:t xml:space="preserve">Éditeur de bon de commande (v3.2.8)</w:t>
-      </w:r>
-    </w:p>
-    <w:p>
-      <w:pPr>
-        <w:pStyle w:val="FirstParagraph"/>
-      </w:pPr>
-      <w:r>
-        <w:t xml:space="preserve">Depuis la v3.2.8, les commandes s’éditent dans le</w:t>
-      </w:r>
-      <w:r>
-        <w:t xml:space="preserve"> </w:t>
-      </w:r>
-      <w:r>
-        <w:rPr>
-          <w:b/>
-          <w:bCs/>
-        </w:rPr>
-        <w:t xml:space="preserve">même éditeur WYSIWYG que les devis</w:t>
-      </w:r>
-      <w:r>
-        <w:t xml:space="preserve"> </w:t>
-      </w:r>
-      <w:r>
-        <w:t xml:space="preserve">: page A4 fidèle au PDF, lignes détaillées, totaux calculés en temps réel.</w:t>
+        <w:t xml:space="preserve">Les boutons</w:t>
+      </w:r>
+      <w:r>
+        <w:t xml:space="preserve"> </w:t>
+      </w:r>
+      <w:r>
+        <w:rPr>
+          <w:b/>
+          <w:bCs/>
+        </w:rPr>
+        <w:t xml:space="preserve">⬇ Exporter CSV</w:t>
+      </w:r>
+      <w:r>
+        <w:t xml:space="preserve"> </w:t>
+      </w:r>
+      <w:r>
+        <w:t xml:space="preserve">et</w:t>
+      </w:r>
+      <w:r>
+        <w:t xml:space="preserve"> </w:t>
+      </w:r>
+      <w:r>
+        <w:rPr>
+          <w:b/>
+          <w:bCs/>
+        </w:rPr>
+        <w:t xml:space="preserve">⬆ Importer CSV</w:t>
+      </w:r>
+      <w:r>
+        <w:t xml:space="preserve"> </w:t>
+      </w:r>
+      <w:r>
+        <w:t xml:space="preserve">permettent d’échanger votre liste de fournisseurs au format tableur.</w:t>
+      </w:r>
+    </w:p>
+    <w:bookmarkEnd w:id="159"/>
+    <w:bookmarkStart w:id="170" w:name="commandes-bons-de-commande"/>
+    <w:p>
+      <w:pPr>
+        <w:pStyle w:val="Heading2"/>
+      </w:pPr>
+      <w:r>
+        <w:t xml:space="preserve">Commandes (bons de commande)</w:t>
       </w:r>
     </w:p>
     <w:p>
@@ -13466,20 +13514,175 @@
       <w:r>
         <w:drawing>
           <wp:inline>
-            <wp:extent cx="5334000" cy="3319106"/>
+            <wp:extent cx="5334000" cy="2637413"/>
             <wp:effectExtent b="0" l="0" r="0" t="0"/>
-            <wp:docPr descr="Éditeur de bon de commande" title="" id="161" name="Picture"/>
+            <wp:docPr descr="Liste des commandes" title="" id="161" name="Picture"/>
             <a:graphic>
               <a:graphicData uri="http://schemas.openxmlformats.org/drawingml/2006/picture">
                 <pic:pic>
                   <pic:nvPicPr>
-                    <pic:cNvPr descr="screenshots/27-commande-editeur.png" id="162" name="Picture"/>
+                    <pic:cNvPr descr="screenshots/22-commandes-liste.png" id="162" name="Picture"/>
                     <pic:cNvPicPr>
                       <a:picLocks noChangeArrowheads="1" noChangeAspect="1"/>
                     </pic:cNvPicPr>
                   </pic:nvPicPr>
                   <pic:blipFill>
                     <a:blip r:embed="rId160"/>
+                    <a:stretch>
+                      <a:fillRect/>
+                    </a:stretch>
+                  </pic:blipFill>
+                  <pic:spPr bwMode="auto">
+                    <a:xfrm>
+                      <a:off x="0" y="0"/>
+                      <a:ext cx="5334000" cy="2637413"/>
+                    </a:xfrm>
+                    <a:prstGeom prst="rect">
+                      <a:avLst/>
+                    </a:prstGeom>
+                    <a:noFill/>
+                    <a:ln w="9525">
+                      <a:noFill/>
+                      <a:headEnd/>
+                      <a:tailEnd/>
+                    </a:ln>
+                  </pic:spPr>
+                </pic:pic>
+              </a:graphicData>
+            </a:graphic>
+          </wp:inline>
+        </w:drawing>
+      </w:r>
+    </w:p>
+    <w:p>
+      <w:pPr>
+        <w:pStyle w:val="ImageCaption"/>
+      </w:pPr>
+      <w:r>
+        <w:t xml:space="preserve">Liste des commandes</w:t>
+      </w:r>
+    </w:p>
+    <w:p>
+      <w:pPr>
+        <w:pStyle w:val="BodyText"/>
+      </w:pPr>
+      <w:r>
+        <w:rPr>
+          <w:b/>
+          <w:bCs/>
+        </w:rPr>
+        <w:t xml:space="preserve">Achats &gt; Commandes</w:t>
+      </w:r>
+      <w:r>
+        <w:t xml:space="preserve"> </w:t>
+      </w:r>
+      <w:r>
+        <w:t xml:space="preserve">liste les bons de commande passés auprès de vos fournisseurs, filtrables par statut (</w:t>
+      </w:r>
+      <w:r>
+        <w:rPr>
+          <w:b/>
+          <w:bCs/>
+        </w:rPr>
+        <w:t xml:space="preserve">Toutes</w:t>
+      </w:r>
+      <w:r>
+        <w:t xml:space="preserve">,</w:t>
+      </w:r>
+      <w:r>
+        <w:t xml:space="preserve"> </w:t>
+      </w:r>
+      <w:r>
+        <w:rPr>
+          <w:b/>
+          <w:bCs/>
+        </w:rPr>
+        <w:t xml:space="preserve">En cours</w:t>
+      </w:r>
+      <w:r>
+        <w:t xml:space="preserve">,</w:t>
+      </w:r>
+      <w:r>
+        <w:t xml:space="preserve"> </w:t>
+      </w:r>
+      <w:r>
+        <w:rPr>
+          <w:b/>
+          <w:bCs/>
+        </w:rPr>
+        <w:t xml:space="preserve">Réceptionnées</w:t>
+      </w:r>
+      <w:r>
+        <w:t xml:space="preserve">,</w:t>
+      </w:r>
+      <w:r>
+        <w:t xml:space="preserve"> </w:t>
+      </w:r>
+      <w:r>
+        <w:rPr>
+          <w:b/>
+          <w:bCs/>
+        </w:rPr>
+        <w:t xml:space="preserve">Annulées</w:t>
+      </w:r>
+      <w:r>
+        <w:t xml:space="preserve">).</w:t>
+      </w:r>
+    </w:p>
+    <w:bookmarkStart w:id="166" w:name="éditeur-de-bon-de-commande-v3.2.8"/>
+    <w:p>
+      <w:pPr>
+        <w:pStyle w:val="Heading3"/>
+      </w:pPr>
+      <w:r>
+        <w:t xml:space="preserve">Éditeur de bon de commande (v3.2.8)</w:t>
+      </w:r>
+    </w:p>
+    <w:p>
+      <w:pPr>
+        <w:pStyle w:val="FirstParagraph"/>
+      </w:pPr>
+      <w:r>
+        <w:t xml:space="preserve">Depuis la v3.2.8, les commandes s’éditent dans le</w:t>
+      </w:r>
+      <w:r>
+        <w:t xml:space="preserve"> </w:t>
+      </w:r>
+      <w:r>
+        <w:rPr>
+          <w:b/>
+          <w:bCs/>
+        </w:rPr>
+        <w:t xml:space="preserve">même éditeur WYSIWYG que les devis</w:t>
+      </w:r>
+      <w:r>
+        <w:t xml:space="preserve"> </w:t>
+      </w:r>
+      <w:r>
+        <w:t xml:space="preserve">: page A4 fidèle au PDF, lignes détaillées, totaux calculés en temps réel.</w:t>
+      </w:r>
+    </w:p>
+    <w:p>
+      <w:pPr>
+        <w:pStyle w:val="CaptionedFigure"/>
+      </w:pPr>
+      <w:r>
+        <w:drawing>
+          <wp:inline>
+            <wp:extent cx="5334000" cy="3319106"/>
+            <wp:effectExtent b="0" l="0" r="0" t="0"/>
+            <wp:docPr descr="Éditeur de bon de commande" title="" id="164" name="Picture"/>
+            <a:graphic>
+              <a:graphicData uri="http://schemas.openxmlformats.org/drawingml/2006/picture">
+                <pic:pic>
+                  <pic:nvPicPr>
+                    <pic:cNvPr descr="screenshots/27-commande-editeur.png" id="165" name="Picture"/>
+                    <pic:cNvPicPr>
+                      <a:picLocks noChangeArrowheads="1" noChangeAspect="1"/>
+                    </pic:cNvPicPr>
+                  </pic:nvPicPr>
+                  <pic:blipFill>
+                    <a:blip r:embed="rId163"/>
                     <a:stretch>
                       <a:fillRect/>
                     </a:stretch>
@@ -13860,13 +14063,155 @@
         <w:t xml:space="preserve">(et non son prix de vente) qui est pré-rempli, s’il est renseigné dans la fiche article.</w:t>
       </w:r>
     </w:p>
-    <w:bookmarkEnd w:id="163"/>
-    <w:bookmarkStart w:id="164" w:name="chaînage-avec-une-facture-dachat"/>
+    <w:bookmarkEnd w:id="166"/>
+    <w:bookmarkStart w:id="167" w:name="envoyer-la-commande-par-email-v3.2.10"/>
     <w:p>
       <w:pPr>
         <w:pStyle w:val="Heading3"/>
       </w:pPr>
       <w:r>
+        <w:t xml:space="preserve">Envoyer la commande par email (v3.2.10)</w:t>
+      </w:r>
+    </w:p>
+    <w:p>
+      <w:pPr>
+        <w:pStyle w:val="FirstParagraph"/>
+      </w:pPr>
+      <w:r>
+        <w:t xml:space="preserve">Le bouton</w:t>
+      </w:r>
+      <w:r>
+        <w:t xml:space="preserve"> </w:t>
+      </w:r>
+      <w:r>
+        <w:rPr>
+          <w:b/>
+          <w:bCs/>
+        </w:rPr>
+        <w:t xml:space="preserve">✉ Envoyer</w:t>
+      </w:r>
+      <w:r>
+        <w:t xml:space="preserve"> </w:t>
+      </w:r>
+      <w:r>
+        <w:t xml:space="preserve">— disponible sur la ligne de la liste et dans la barre d’outils de l’éditeur (commande déjà enregistrée) — ouvre une fenêtre de confirmation avec l’</w:t>
+      </w:r>
+      <w:r>
+        <w:rPr>
+          <w:b/>
+          <w:bCs/>
+        </w:rPr>
+        <w:t xml:space="preserve">email du fournisseur pré-rempli</w:t>
+      </w:r>
+      <w:r>
+        <w:t xml:space="preserve"> </w:t>
+      </w:r>
+      <w:r>
+        <w:t xml:space="preserve">(si renseigné dans l’annuaire</w:t>
+      </w:r>
+      <w:r>
+        <w:t xml:space="preserve"> </w:t>
+      </w:r>
+      <w:r>
+        <w:rPr>
+          <w:b/>
+          <w:bCs/>
+        </w:rPr>
+        <w:t xml:space="preserve">Fournisseurs</w:t>
+      </w:r>
+      <w:r>
+        <w:t xml:space="preserve">). Validez pour envoyer le PDF du bon de commande en pièce jointe.</w:t>
+      </w:r>
+    </w:p>
+    <w:bookmarkEnd w:id="167"/>
+    <w:bookmarkStart w:id="168" w:name="facturer-une-commande-v3.2.10"/>
+    <w:p>
+      <w:pPr>
+        <w:pStyle w:val="Heading3"/>
+      </w:pPr>
+      <w:r>
+        <w:t xml:space="preserve">Facturer une commande (v3.2.10)</w:t>
+      </w:r>
+    </w:p>
+    <w:p>
+      <w:pPr>
+        <w:pStyle w:val="FirstParagraph"/>
+      </w:pPr>
+      <w:r>
+        <w:t xml:space="preserve">Tant qu’aucune facture d’achat n’est liée, le bouton</w:t>
+      </w:r>
+      <w:r>
+        <w:t xml:space="preserve"> </w:t>
+      </w:r>
+      <w:r>
+        <w:rPr>
+          <w:b/>
+          <w:bCs/>
+        </w:rPr>
+        <w:t xml:space="preserve">🧾 → Facture d’achat</w:t>
+      </w:r>
+      <w:r>
+        <w:t xml:space="preserve"> </w:t>
+      </w:r>
+      <w:r>
+        <w:t xml:space="preserve">— sur la ligne de la liste et dans la barre d’outils de l’éditeur — ouvre l’éditeur de</w:t>
+      </w:r>
+      <w:r>
+        <w:t xml:space="preserve"> </w:t>
+      </w:r>
+      <w:r>
+        <w:rPr>
+          <w:b/>
+          <w:bCs/>
+        </w:rPr>
+        <w:t xml:space="preserve">facture d’achat pré-rempli</w:t>
+      </w:r>
+      <w:r>
+        <w:t xml:space="preserve"> </w:t>
+      </w:r>
+      <w:r>
+        <w:t xml:space="preserve">avec le fournisseur, l’objet et les lignes de la commande. Complétez le</w:t>
+      </w:r>
+      <w:r>
+        <w:t xml:space="preserve"> </w:t>
+      </w:r>
+      <w:r>
+        <w:rPr>
+          <w:b/>
+          <w:bCs/>
+        </w:rPr>
+        <w:t xml:space="preserve">N° de facture fournisseur</w:t>
+      </w:r>
+      <w:r>
+        <w:t xml:space="preserve"> </w:t>
+      </w:r>
+      <w:r>
+        <w:t xml:space="preserve">puis enregistrez : la commande est automatiquement</w:t>
+      </w:r>
+      <w:r>
+        <w:t xml:space="preserve"> </w:t>
+      </w:r>
+      <w:r>
+        <w:rPr>
+          <w:b/>
+          <w:bCs/>
+        </w:rPr>
+        <w:t xml:space="preserve">liée</w:t>
+      </w:r>
+      <w:r>
+        <w:t xml:space="preserve"> </w:t>
+      </w:r>
+      <w:r>
+        <w:t xml:space="preserve">à la nouvelle facture d’achat.</w:t>
+      </w:r>
+    </w:p>
+    <w:bookmarkEnd w:id="168"/>
+    <w:bookmarkStart w:id="169" w:name="chaînage-avec-une-facture-dachat"/>
+    <w:p>
+      <w:pPr>
+        <w:pStyle w:val="Heading3"/>
+      </w:pPr>
+      <w:r>
         <w:t xml:space="preserve">Chaînage avec une facture d’achat</w:t>
       </w:r>
     </w:p>
@@ -13891,7 +14236,23 @@
         <w:t xml:space="preserve"> </w:t>
       </w:r>
       <w:r>
-        <w:t xml:space="preserve">de la liste associe une commande à une facture d’achat. Ce chaînage est</w:t>
+        <w:t xml:space="preserve">de la liste associe manuellement une commande à une facture d’achat existante (le chaînage automatique via</w:t>
+      </w:r>
+      <w:r>
+        <w:t xml:space="preserve"> </w:t>
+      </w:r>
+      <w:r>
+        <w:rPr>
+          <w:b/>
+          <w:bCs/>
+        </w:rPr>
+        <w:t xml:space="preserve">🧾 → Facture d’achat</w:t>
+      </w:r>
+      <w:r>
+        <w:t xml:space="preserve"> </w:t>
+      </w:r>
+      <w:r>
+        <w:t xml:space="preserve">ci-dessus produit le même lien). Ce chaînage est</w:t>
       </w:r>
       <w:r>
         <w:t xml:space="preserve"> </w:t>
@@ -13910,9 +14271,9 @@
         <w:t xml:space="preserve">: facultatif, modifiable à tout moment, sans incidence sur le scellement. Il aide à suivre le cycle commande → réception → facturation, sans imposer de contrainte d’ordre ni verrouiller les documents.</w:t>
       </w:r>
     </w:p>
-    <w:bookmarkEnd w:id="164"/>
-    <w:bookmarkEnd w:id="165"/>
-    <w:bookmarkStart w:id="171" w:name="factures-dachats"/>
+    <w:bookmarkEnd w:id="169"/>
+    <w:bookmarkEnd w:id="170"/>
+    <w:bookmarkStart w:id="176" w:name="factures-dachats"/>
     <w:p>
       <w:pPr>
         <w:pStyle w:val="Heading2"/>
@@ -13968,7 +14329,7 @@
         <w:t xml:space="preserve">.</w:t>
       </w:r>
     </w:p>
-    <w:bookmarkStart w:id="169" w:name="éditeur-de-facture-dachat-v3.2.8"/>
+    <w:bookmarkStart w:id="174" w:name="éditeur-de-facture-dachat-v3.2.8"/>
     <w:p>
       <w:pPr>
         <w:pStyle w:val="Heading3"/>
@@ -13994,18 +14355,18 @@
           <wp:inline>
             <wp:extent cx="5334000" cy="3319106"/>
             <wp:effectExtent b="0" l="0" r="0" t="0"/>
-            <wp:docPr descr="Éditeur de facture d’achat" title="" id="167" name="Picture"/>
+            <wp:docPr descr="Éditeur de facture d’achat" title="" id="172" name="Picture"/>
             <a:graphic>
               <a:graphicData uri="http://schemas.openxmlformats.org/drawingml/2006/picture">
                 <pic:pic>
                   <pic:nvPicPr>
-                    <pic:cNvPr descr="screenshots/28-facture-achat-editeur.png" id="168" name="Picture"/>
+                    <pic:cNvPr descr="screenshots/28-facture-achat-editeur.png" id="173" name="Picture"/>
                     <pic:cNvPicPr>
                       <a:picLocks noChangeArrowheads="1" noChangeAspect="1"/>
                     </pic:cNvPicPr>
                   </pic:nvPicPr>
                   <pic:blipFill>
-                    <a:blip r:embed="rId166"/>
+                    <a:blip r:embed="rId171"/>
                     <a:stretch>
                       <a:fillRect/>
                     </a:stretch>
@@ -14239,8 +14600,8 @@
         <w:t xml:space="preserve">: le document de référence est celui émis par le fournisseur, FacturPro ne fait que l’enregistrer.</w:t>
       </w:r>
     </w:p>
-    <w:bookmarkEnd w:id="169"/>
-    <w:bookmarkStart w:id="170" w:name="comptabilité-automatique"/>
+    <w:bookmarkEnd w:id="174"/>
+    <w:bookmarkStart w:id="175" w:name="comptabilité-automatique"/>
     <w:p>
       <w:pPr>
         <w:pStyle w:val="Heading3"/>
@@ -14442,10 +14803,10 @@
         </w:pict>
       </w:r>
     </w:p>
-    <w:bookmarkEnd w:id="170"/>
-    <w:bookmarkEnd w:id="171"/>
-    <w:bookmarkEnd w:id="172"/>
-    <w:bookmarkStart w:id="183" w:name="statistiques"/>
+    <w:bookmarkEnd w:id="175"/>
+    <w:bookmarkEnd w:id="176"/>
+    <w:bookmarkEnd w:id="177"/>
+    <w:bookmarkStart w:id="188" w:name="statistiques"/>
     <w:p>
       <w:pPr>
         <w:pStyle w:val="Heading1"/>
@@ -14463,18 +14824,18 @@
           <wp:inline>
             <wp:extent cx="5334000" cy="2637413"/>
             <wp:effectExtent b="0" l="0" r="0" t="0"/>
-            <wp:docPr descr="Statistiques KPIs" title="" id="174" name="Picture"/>
+            <wp:docPr descr="Statistiques KPIs" title="" id="179" name="Picture"/>
             <a:graphic>
               <a:graphicData uri="http://schemas.openxmlformats.org/drawingml/2006/picture">
                 <pic:pic>
                   <pic:nvPicPr>
-                    <pic:cNvPr descr="screenshots/08-stats-kpis.png" id="175" name="Picture"/>
+                    <pic:cNvPr descr="screenshots/08-stats-kpis.png" id="180" name="Picture"/>
                     <pic:cNvPicPr>
                       <a:picLocks noChangeArrowheads="1" noChangeAspect="1"/>
                     </pic:cNvPicPr>
                   </pic:nvPicPr>
                   <pic:blipFill>
-                    <a:blip r:embed="rId173"/>
+                    <a:blip r:embed="rId178"/>
                     <a:stretch>
                       <a:fillRect/>
                     </a:stretch>
@@ -14509,7 +14870,7 @@
         <w:t xml:space="preserve">Statistiques KPIs</w:t>
       </w:r>
     </w:p>
-    <w:bookmarkStart w:id="176" w:name="kpis-indicateurs-clés"/>
+    <w:bookmarkStart w:id="181" w:name="kpis-indicateurs-clés"/>
     <w:p>
       <w:pPr>
         <w:pStyle w:val="Heading2"/>
@@ -14746,8 +15107,8 @@
         </w:tc>
       </w:tr>
     </w:tbl>
-    <w:bookmarkEnd w:id="176"/>
-    <w:bookmarkStart w:id="177" w:name="balance-âgée"/>
+    <w:bookmarkEnd w:id="181"/>
+    <w:bookmarkStart w:id="182" w:name="balance-âgée"/>
     <w:p>
       <w:pPr>
         <w:pStyle w:val="Heading2"/>
@@ -14922,8 +15283,8 @@
         </w:tc>
       </w:tr>
     </w:tbl>
-    <w:bookmarkEnd w:id="177"/>
-    <w:bookmarkStart w:id="178" w:name="évolution-du-ca"/>
+    <w:bookmarkEnd w:id="182"/>
+    <w:bookmarkStart w:id="183" w:name="évolution-du-ca"/>
     <w:p>
       <w:pPr>
         <w:pStyle w:val="Heading2"/>
@@ -14940,8 +15301,8 @@
         <w:t xml:space="preserve">Graphique en barres sur 12 mois glissants : CA facturé vs CA encaissé.</w:t>
       </w:r>
     </w:p>
-    <w:bookmarkEnd w:id="178"/>
-    <w:bookmarkStart w:id="179" w:name="pipeline-commercial"/>
+    <w:bookmarkEnd w:id="183"/>
+    <w:bookmarkStart w:id="184" w:name="pipeline-commercial"/>
     <w:p>
       <w:pPr>
         <w:pStyle w:val="Heading2"/>
@@ -14958,8 +15319,8 @@
         <w:t xml:space="preserve">Entonnoir brouillons → envoyés → acceptés → facturés, avec montants à chaque étape.</w:t>
       </w:r>
     </w:p>
-    <w:bookmarkEnd w:id="179"/>
-    <w:bookmarkStart w:id="180" w:name="top-clients-et-top-articles"/>
+    <w:bookmarkEnd w:id="184"/>
+    <w:bookmarkStart w:id="185" w:name="top-clients-et-top-articles"/>
     <w:p>
       <w:pPr>
         <w:pStyle w:val="Heading2"/>
@@ -14976,8 +15337,8 @@
         <w:t xml:space="preserve">Top 10 clients par CA HT et top 10 articles sur l’année.</w:t>
       </w:r>
     </w:p>
-    <w:bookmarkEnd w:id="180"/>
-    <w:bookmarkStart w:id="181" w:name="trésorerie-et-dso"/>
+    <w:bookmarkEnd w:id="185"/>
+    <w:bookmarkStart w:id="186" w:name="trésorerie-et-dso"/>
     <w:p>
       <w:pPr>
         <w:pStyle w:val="Heading2"/>
@@ -15030,8 +15391,8 @@
         <w:t xml:space="preserve">: encaissements attendus groupés par semaine sur 90 jours.</w:t>
       </w:r>
     </w:p>
-    <w:bookmarkEnd w:id="181"/>
-    <w:bookmarkStart w:id="182" w:name="taux-de-marge-catalogue"/>
+    <w:bookmarkEnd w:id="186"/>
+    <w:bookmarkStart w:id="187" w:name="taux-de-marge-catalogue"/>
     <w:p>
       <w:pPr>
         <w:pStyle w:val="Heading2"/>
@@ -15055,9 +15416,9 @@
         </w:pict>
       </w:r>
     </w:p>
-    <w:bookmarkEnd w:id="182"/>
-    <w:bookmarkEnd w:id="183"/>
-    <w:bookmarkStart w:id="190" w:name="déclaration-tva-ca3"/>
+    <w:bookmarkEnd w:id="187"/>
+    <w:bookmarkEnd w:id="188"/>
+    <w:bookmarkStart w:id="195" w:name="déclaration-tva-ca3"/>
     <w:p>
       <w:pPr>
         <w:pStyle w:val="Heading1"/>
@@ -15075,18 +15436,18 @@
           <wp:inline>
             <wp:extent cx="5334000" cy="2637413"/>
             <wp:effectExtent b="0" l="0" r="0" t="0"/>
-            <wp:docPr descr="Déclaration TVA" title="" id="185" name="Picture"/>
+            <wp:docPr descr="Déclaration TVA" title="" id="190" name="Picture"/>
             <a:graphic>
               <a:graphicData uri="http://schemas.openxmlformats.org/drawingml/2006/picture">
                 <pic:pic>
                   <pic:nvPicPr>
-                    <pic:cNvPr descr="screenshots/09-decl-tva.png" id="186" name="Picture"/>
+                    <pic:cNvPr descr="screenshots/09-decl-tva.png" id="191" name="Picture"/>
                     <pic:cNvPicPr>
                       <a:picLocks noChangeArrowheads="1" noChangeAspect="1"/>
                     </pic:cNvPicPr>
                   </pic:nvPicPr>
                   <pic:blipFill>
-                    <a:blip r:embed="rId184"/>
+                    <a:blip r:embed="rId189"/>
                     <a:stretch>
                       <a:fillRect/>
                     </a:stretch>
@@ -15142,7 +15503,7 @@
         <w:t xml:space="preserve">. Sélectionnez la période (mensuelle, trimestrielle, annuelle).</w:t>
       </w:r>
     </w:p>
-    <w:bookmarkStart w:id="187" w:name="Xc38e0630106d798950df11e300682f51b042207"/>
+    <w:bookmarkStart w:id="192" w:name="Xc38e0630106d798950df11e300682f51b042207"/>
     <w:p>
       <w:pPr>
         <w:pStyle w:val="Heading2"/>
@@ -15325,8 +15686,8 @@
         </w:tc>
       </w:tr>
     </w:tbl>
-    <w:bookmarkEnd w:id="187"/>
-    <w:bookmarkStart w:id="188" w:name="section-b-tva-déductible-saisie-manuelle"/>
+    <w:bookmarkEnd w:id="192"/>
+    <w:bookmarkStart w:id="193" w:name="section-b-tva-déductible-saisie-manuelle"/>
     <w:p>
       <w:pPr>
         <w:pStyle w:val="Heading2"/>
@@ -15462,8 +15823,8 @@
         </w:tc>
       </w:tr>
     </w:tbl>
-    <w:bookmarkEnd w:id="188"/>
-    <w:bookmarkStart w:id="189" w:name="section-c-solde-tva-à-payer"/>
+    <w:bookmarkEnd w:id="193"/>
+    <w:bookmarkStart w:id="194" w:name="section-c-solde-tva-à-payer"/>
     <w:p>
       <w:pPr>
         <w:pStyle w:val="Heading2"/>
@@ -15521,9 +15882,9 @@
         </w:pict>
       </w:r>
     </w:p>
-    <w:bookmarkEnd w:id="189"/>
-    <w:bookmarkEnd w:id="190"/>
-    <w:bookmarkStart w:id="198" w:name="exercices-comptables"/>
+    <w:bookmarkEnd w:id="194"/>
+    <w:bookmarkEnd w:id="195"/>
+    <w:bookmarkStart w:id="203" w:name="exercices-comptables"/>
     <w:p>
       <w:pPr>
         <w:pStyle w:val="Heading1"/>
@@ -15541,18 +15902,18 @@
           <wp:inline>
             <wp:extent cx="5334000" cy="2637413"/>
             <wp:effectExtent b="0" l="0" r="0" t="0"/>
-            <wp:docPr descr="Exercices comptables" title="" id="192" name="Picture"/>
+            <wp:docPr descr="Exercices comptables" title="" id="197" name="Picture"/>
             <a:graphic>
               <a:graphicData uri="http://schemas.openxmlformats.org/drawingml/2006/picture">
                 <pic:pic>
                   <pic:nvPicPr>
-                    <pic:cNvPr descr="screenshots/10-exercices.png" id="193" name="Picture"/>
+                    <pic:cNvPr descr="screenshots/10-exercices.png" id="198" name="Picture"/>
                     <pic:cNvPicPr>
                       <a:picLocks noChangeArrowheads="1" noChangeAspect="1"/>
                     </pic:cNvPicPr>
                   </pic:nvPicPr>
                   <pic:blipFill>
-                    <a:blip r:embed="rId191"/>
+                    <a:blip r:embed="rId196"/>
                     <a:stretch>
                       <a:fillRect/>
                     </a:stretch>
@@ -15611,7 +15972,7 @@
         <w:t xml:space="preserve">en droit français (art. L123-12 Code de Commerce et art. 88 loi 2015-1785 anti-fraude TVA).</w:t>
       </w:r>
     </w:p>
-    <w:bookmarkStart w:id="194" w:name="ouvrir-un-exercice"/>
+    <w:bookmarkStart w:id="199" w:name="ouvrir-un-exercice"/>
     <w:p>
       <w:pPr>
         <w:pStyle w:val="Heading2"/>
@@ -15729,8 +16090,8 @@
         <w:t xml:space="preserve">Si votre exercice commence le 1er avril 2025 et se termine le 31 mars 2026, sélectionnez l’année 2025 et définissez la date d’ouverture au 01/04/2025.</w:t>
       </w:r>
     </w:p>
-    <w:bookmarkEnd w:id="194"/>
-    <w:bookmarkStart w:id="195" w:name="clôturer-un-exercice"/>
+    <w:bookmarkEnd w:id="199"/>
+    <w:bookmarkStart w:id="200" w:name="clôturer-un-exercice"/>
     <w:p>
       <w:pPr>
         <w:pStyle w:val="Heading2"/>
@@ -15917,8 +16278,8 @@
         <w:t xml:space="preserve">Pour l’exercice en cours, attendez que toutes les factures soient saisies.</w:t>
       </w:r>
     </w:p>
-    <w:bookmarkEnd w:id="195"/>
-    <w:bookmarkStart w:id="196" w:name="télécharger-le-fec-par-exercice"/>
+    <w:bookmarkEnd w:id="200"/>
+    <w:bookmarkStart w:id="201" w:name="télécharger-le-fec-par-exercice"/>
     <w:p>
       <w:pPr>
         <w:pStyle w:val="Heading2"/>
@@ -16002,8 +16363,8 @@
         <w:t xml:space="preserve">.</w:t>
       </w:r>
     </w:p>
-    <w:bookmarkEnd w:id="196"/>
-    <w:bookmarkStart w:id="197" w:name="procès-verbal-de-clôture-pv"/>
+    <w:bookmarkEnd w:id="201"/>
+    <w:bookmarkStart w:id="202" w:name="procès-verbal-de-clôture-pv"/>
     <w:p>
       <w:pPr>
         <w:pStyle w:val="Heading2"/>
@@ -16161,9 +16522,9 @@
         </w:pict>
       </w:r>
     </w:p>
-    <w:bookmarkEnd w:id="197"/>
-    <w:bookmarkEnd w:id="198"/>
-    <w:bookmarkStart w:id="204" w:name="lettrage"/>
+    <w:bookmarkEnd w:id="202"/>
+    <w:bookmarkEnd w:id="203"/>
+    <w:bookmarkStart w:id="209" w:name="lettrage"/>
     <w:p>
       <w:pPr>
         <w:pStyle w:val="Heading1"/>
@@ -16181,18 +16542,18 @@
           <wp:inline>
             <wp:extent cx="5334000" cy="2637413"/>
             <wp:effectExtent b="0" l="0" r="0" t="0"/>
-            <wp:docPr descr="Lettrage comptable" title="" id="200" name="Picture"/>
+            <wp:docPr descr="Lettrage comptable" title="" id="205" name="Picture"/>
             <a:graphic>
               <a:graphicData uri="http://schemas.openxmlformats.org/drawingml/2006/picture">
                 <pic:pic>
                   <pic:nvPicPr>
-                    <pic:cNvPr descr="screenshots/11-lettrage.png" id="201" name="Picture"/>
+                    <pic:cNvPr descr="screenshots/11-lettrage.png" id="206" name="Picture"/>
                     <pic:cNvPicPr>
                       <a:picLocks noChangeArrowheads="1" noChangeAspect="1"/>
                     </pic:cNvPicPr>
                   </pic:nvPicPr>
                   <pic:blipFill>
-                    <a:blip r:embed="rId199"/>
+                    <a:blip r:embed="rId204"/>
                     <a:stretch>
                       <a:fillRect/>
                     </a:stretch>
@@ -16235,7 +16596,7 @@
         <w:t xml:space="preserve">Le lettrage rapproche les écritures du compte 411 Clients : chaque débit (facture émise) est mis en regard de son crédit (paiement ou avoir).</w:t>
       </w:r>
     </w:p>
-    <w:bookmarkStart w:id="202" w:name="lettrage-automatique"/>
+    <w:bookmarkStart w:id="207" w:name="lettrage-automatique"/>
     <w:p>
       <w:pPr>
         <w:pStyle w:val="Heading2"/>
@@ -16351,8 +16712,8 @@
         </w:tc>
       </w:tr>
     </w:tbl>
-    <w:bookmarkEnd w:id="202"/>
-    <w:bookmarkStart w:id="203" w:name="lettrage-manuel"/>
+    <w:bookmarkEnd w:id="207"/>
+    <w:bookmarkStart w:id="208" w:name="lettrage-manuel"/>
     <w:p>
       <w:pPr>
         <w:pStyle w:val="Heading2"/>
@@ -16448,9 +16809,9 @@
         </w:pict>
       </w:r>
     </w:p>
-    <w:bookmarkEnd w:id="203"/>
-    <w:bookmarkEnd w:id="204"/>
-    <w:bookmarkStart w:id="208" w:name="journal-daudit"/>
+    <w:bookmarkEnd w:id="208"/>
+    <w:bookmarkEnd w:id="209"/>
+    <w:bookmarkStart w:id="213" w:name="journal-daudit"/>
     <w:p>
       <w:pPr>
         <w:pStyle w:val="Heading1"/>
@@ -16468,18 +16829,18 @@
           <wp:inline>
             <wp:extent cx="5334000" cy="2637413"/>
             <wp:effectExtent b="0" l="0" r="0" t="0"/>
-            <wp:docPr descr="Journal d’audit" title="" id="206" name="Picture"/>
+            <wp:docPr descr="Journal d’audit" title="" id="211" name="Picture"/>
             <a:graphic>
               <a:graphicData uri="http://schemas.openxmlformats.org/drawingml/2006/picture">
                 <pic:pic>
                   <pic:nvPicPr>
-                    <pic:cNvPr descr="screenshots/18-audit.png" id="207" name="Picture"/>
+                    <pic:cNvPr descr="screenshots/18-audit.png" id="212" name="Picture"/>
                     <pic:cNvPicPr>
                       <a:picLocks noChangeArrowheads="1" noChangeAspect="1"/>
                     </pic:cNvPicPr>
                   </pic:nvPicPr>
                   <pic:blipFill>
-                    <a:blip r:embed="rId205"/>
+                    <a:blip r:embed="rId210"/>
                     <a:stretch>
                       <a:fillRect/>
                     </a:stretch>
@@ -16679,8 +17040,8 @@
         </w:pict>
       </w:r>
     </w:p>
-    <w:bookmarkEnd w:id="208"/>
-    <w:bookmarkStart w:id="212" w:name="archives"/>
+    <w:bookmarkEnd w:id="213"/>
+    <w:bookmarkStart w:id="217" w:name="archives"/>
     <w:p>
       <w:pPr>
         <w:pStyle w:val="Heading1"/>
@@ -16698,18 +17059,18 @@
           <wp:inline>
             <wp:extent cx="5334000" cy="2637413"/>
             <wp:effectExtent b="0" l="0" r="0" t="0"/>
-            <wp:docPr descr="Archives" title="" id="210" name="Picture"/>
+            <wp:docPr descr="Archives" title="" id="215" name="Picture"/>
             <a:graphic>
               <a:graphicData uri="http://schemas.openxmlformats.org/drawingml/2006/picture">
                 <pic:pic>
                   <pic:nvPicPr>
-                    <pic:cNvPr descr="screenshots/12-archives.png" id="211" name="Picture"/>
+                    <pic:cNvPr descr="screenshots/12-archives.png" id="216" name="Picture"/>
                     <pic:cNvPicPr>
                       <a:picLocks noChangeArrowheads="1" noChangeAspect="1"/>
                     </pic:cNvPicPr>
                   </pic:nvPicPr>
                   <pic:blipFill>
-                    <a:blip r:embed="rId209"/>
+                    <a:blip r:embed="rId214"/>
                     <a:stretch>
                       <a:fillRect/>
                     </a:stretch>
@@ -16834,8 +17195,8 @@
         </w:pict>
       </w:r>
     </w:p>
-    <w:bookmarkEnd w:id="212"/>
-    <w:bookmarkStart w:id="216" w:name="relances-automatiques-v2.13.0"/>
+    <w:bookmarkEnd w:id="217"/>
+    <w:bookmarkStart w:id="221" w:name="relances-automatiques-v2.13.0"/>
     <w:p>
       <w:pPr>
         <w:pStyle w:val="Heading1"/>
@@ -16865,7 +17226,7 @@
         <w:t xml:space="preserve">, FacturPro envoie automatiquement chaque jour un email de relance aux clients dont la facture est en retard.</w:t>
       </w:r>
     </w:p>
-    <w:bookmarkStart w:id="213" w:name="comment-ça-fonctionne"/>
+    <w:bookmarkStart w:id="218" w:name="comment-ça-fonctionne"/>
     <w:p>
       <w:pPr>
         <w:pStyle w:val="Heading2"/>
@@ -16937,8 +17298,8 @@
         <w:t xml:space="preserve">La date de dernière relance et le compteur sont mis à jour sur la facture.</w:t>
       </w:r>
     </w:p>
-    <w:bookmarkEnd w:id="213"/>
-    <w:bookmarkStart w:id="214" w:name="email-de-relance-automatique"/>
+    <w:bookmarkEnd w:id="218"/>
+    <w:bookmarkStart w:id="219" w:name="email-de-relance-automatique"/>
     <w:p>
       <w:pPr>
         <w:pStyle w:val="Heading2"/>
@@ -16972,8 +17333,8 @@
         <w:t xml:space="preserve">Le corps mentionne : le numéro de facture, le montant TTC, la date d’échéance et le nombre de jours de retard.</w:t>
       </w:r>
     </w:p>
-    <w:bookmarkEnd w:id="214"/>
-    <w:bookmarkStart w:id="215" w:name="suivi"/>
+    <w:bookmarkEnd w:id="219"/>
+    <w:bookmarkStart w:id="220" w:name="suivi"/>
     <w:p>
       <w:pPr>
         <w:pStyle w:val="Heading2"/>
@@ -17041,9 +17402,9 @@
         </w:pict>
       </w:r>
     </w:p>
-    <w:bookmarkEnd w:id="215"/>
-    <w:bookmarkEnd w:id="216"/>
-    <w:bookmarkStart w:id="224" w:name="gestion-des-utilisateurs"/>
+    <w:bookmarkEnd w:id="220"/>
+    <w:bookmarkEnd w:id="221"/>
+    <w:bookmarkStart w:id="229" w:name="gestion-des-utilisateurs"/>
     <w:p>
       <w:pPr>
         <w:pStyle w:val="Heading1"/>
@@ -17052,7 +17413,7 @@
         <w:t xml:space="preserve">Gestion des utilisateurs</w:t>
       </w:r>
     </w:p>
-    <w:bookmarkStart w:id="217" w:name="rôles"/>
+    <w:bookmarkStart w:id="222" w:name="rôles"/>
     <w:p>
       <w:pPr>
         <w:pStyle w:val="Heading2"/>
@@ -17235,8 +17596,8 @@
         </w:tc>
       </w:tr>
     </w:tbl>
-    <w:bookmarkEnd w:id="217"/>
-    <w:bookmarkStart w:id="218" w:name="visibilité-des-commerciaux"/>
+    <w:bookmarkEnd w:id="222"/>
+    <w:bookmarkStart w:id="223" w:name="visibilité-des-commerciaux"/>
     <w:p>
       <w:pPr>
         <w:pStyle w:val="Heading2"/>
@@ -17295,8 +17656,8 @@
         <w:t xml:space="preserve">.</w:t>
       </w:r>
     </w:p>
-    <w:bookmarkEnd w:id="218"/>
-    <w:bookmarkStart w:id="223" w:name="multi-société"/>
+    <w:bookmarkEnd w:id="223"/>
+    <w:bookmarkStart w:id="228" w:name="multi-société"/>
     <w:p>
       <w:pPr>
         <w:pStyle w:val="Heading2"/>
@@ -17341,7 +17702,7 @@
         <w:t xml:space="preserve">- Le commutateur de société apparaît lors de la connexion si plusieurs entités sont accessibles.</w:t>
       </w:r>
     </w:p>
-    <w:bookmarkStart w:id="222" w:name="gestion-des-sociétés"/>
+    <w:bookmarkStart w:id="227" w:name="gestion-des-sociétés"/>
     <w:p>
       <w:pPr>
         <w:pStyle w:val="Heading3"/>
@@ -17359,18 +17720,18 @@
           <wp:inline>
             <wp:extent cx="5334000" cy="2637413"/>
             <wp:effectExtent b="0" l="0" r="0" t="0"/>
-            <wp:docPr descr="Gestion des sociétés" title="" id="220" name="Picture"/>
+            <wp:docPr descr="Gestion des sociétés" title="" id="225" name="Picture"/>
             <a:graphic>
               <a:graphicData uri="http://schemas.openxmlformats.org/drawingml/2006/picture">
                 <pic:pic>
                   <pic:nvPicPr>
-                    <pic:cNvPr descr="screenshots/25-societes-gestion.png" id="221" name="Picture"/>
+                    <pic:cNvPr descr="screenshots/25-societes-gestion.png" id="226" name="Picture"/>
                     <pic:cNvPicPr>
                       <a:picLocks noChangeArrowheads="1" noChangeAspect="1"/>
                     </pic:cNvPicPr>
                   </pic:nvPicPr>
                   <pic:blipFill>
-                    <a:blip r:embed="rId219"/>
+                    <a:blip r:embed="rId224"/>
                     <a:stretch>
                       <a:fillRect/>
                     </a:stretch>
@@ -17620,10 +17981,10 @@
         </w:pict>
       </w:r>
     </w:p>
-    <w:bookmarkEnd w:id="222"/>
-    <w:bookmarkEnd w:id="223"/>
-    <w:bookmarkEnd w:id="224"/>
-    <w:bookmarkStart w:id="239" w:name="sauvegardes"/>
+    <w:bookmarkEnd w:id="227"/>
+    <w:bookmarkEnd w:id="228"/>
+    <w:bookmarkEnd w:id="229"/>
+    <w:bookmarkStart w:id="244" w:name="sauvegardes"/>
     <w:p>
       <w:pPr>
         <w:pStyle w:val="Heading1"/>
@@ -17641,18 +18002,18 @@
           <wp:inline>
             <wp:extent cx="5334000" cy="2637413"/>
             <wp:effectExtent b="0" l="0" r="0" t="0"/>
-            <wp:docPr descr="Sauvegardes" title="" id="226" name="Picture"/>
+            <wp:docPr descr="Sauvegardes" title="" id="231" name="Picture"/>
             <a:graphic>
               <a:graphicData uri="http://schemas.openxmlformats.org/drawingml/2006/picture">
                 <pic:pic>
                   <pic:nvPicPr>
-                    <pic:cNvPr descr="screenshots/19-sauvegardes.png" id="227" name="Picture"/>
+                    <pic:cNvPr descr="screenshots/19-sauvegardes.png" id="232" name="Picture"/>
                     <pic:cNvPicPr>
                       <a:picLocks noChangeArrowheads="1" noChangeAspect="1"/>
                     </pic:cNvPicPr>
                   </pic:nvPicPr>
                   <pic:blipFill>
-                    <a:blip r:embed="rId225"/>
+                    <a:blip r:embed="rId230"/>
                     <a:stretch>
                       <a:fillRect/>
                     </a:stretch>
@@ -17687,7 +18048,7 @@
         <w:t xml:space="preserve">Sauvegardes</w:t>
       </w:r>
     </w:p>
-    <w:bookmarkStart w:id="228" w:name="configuration-admin-uniquement"/>
+    <w:bookmarkStart w:id="233" w:name="configuration-admin-uniquement"/>
     <w:p>
       <w:pPr>
         <w:pStyle w:val="Heading2"/>
@@ -17893,8 +18254,8 @@
         <w:t xml:space="preserve">.</w:t>
       </w:r>
     </w:p>
-    <w:bookmarkEnd w:id="228"/>
-    <w:bookmarkStart w:id="229" w:name="lancer-une-sauvegarde-manuelle"/>
+    <w:bookmarkEnd w:id="233"/>
+    <w:bookmarkStart w:id="234" w:name="lancer-une-sauvegarde-manuelle"/>
     <w:p>
       <w:pPr>
         <w:pStyle w:val="Heading2"/>
@@ -17924,8 +18285,8 @@
         <w:t xml:space="preserve">.</w:t>
       </w:r>
     </w:p>
-    <w:bookmarkEnd w:id="229"/>
-    <w:bookmarkStart w:id="230" w:name="restaurer"/>
+    <w:bookmarkEnd w:id="234"/>
+    <w:bookmarkStart w:id="235" w:name="restaurer"/>
     <w:p>
       <w:pPr>
         <w:pStyle w:val="Heading2"/>
@@ -18031,8 +18392,8 @@
         <w:t xml:space="preserve"> sauvegarde.sql</w:t>
       </w:r>
     </w:p>
-    <w:bookmarkEnd w:id="230"/>
-    <w:bookmarkStart w:id="234" w:name="sauvegarder-et-restaurer-une-société"/>
+    <w:bookmarkEnd w:id="235"/>
+    <w:bookmarkStart w:id="239" w:name="sauvegarder-et-restaurer-une-société"/>
     <w:p>
       <w:pPr>
         <w:pStyle w:val="Heading2"/>
@@ -18050,18 +18411,18 @@
           <wp:inline>
             <wp:extent cx="5334000" cy="2637413"/>
             <wp:effectExtent b="0" l="0" r="0" t="0"/>
-            <wp:docPr descr="Sauvegarde de société" title="" id="232" name="Picture"/>
+            <wp:docPr descr="Sauvegarde de société" title="" id="237" name="Picture"/>
             <a:graphic>
               <a:graphicData uri="http://schemas.openxmlformats.org/drawingml/2006/picture">
                 <pic:pic>
                   <pic:nvPicPr>
-                    <pic:cNvPr descr="screenshots/26-sauvegarde-societe.png" id="233" name="Picture"/>
+                    <pic:cNvPr descr="screenshots/26-sauvegarde-societe.png" id="238" name="Picture"/>
                     <pic:cNvPicPr>
                       <a:picLocks noChangeArrowheads="1" noChangeAspect="1"/>
                     </pic:cNvPicPr>
                   </pic:nvPicPr>
                   <pic:blipFill>
-                    <a:blip r:embed="rId231"/>
+                    <a:blip r:embed="rId236"/>
                     <a:stretch>
                       <a:fillRect/>
                     </a:stretch>
@@ -18260,8 +18621,8 @@
         <w:t xml:space="preserve">Les options de restauration/import sont réservées au super-administrateur.</w:t>
       </w:r>
     </w:p>
-    <w:bookmarkEnd w:id="234"/>
-    <w:bookmarkStart w:id="238" w:name="maintenance-de-la-base-de-données"/>
+    <w:bookmarkEnd w:id="239"/>
+    <w:bookmarkStart w:id="243" w:name="maintenance-de-la-base-de-données"/>
     <w:p>
       <w:pPr>
         <w:pStyle w:val="Heading2"/>
@@ -18279,18 +18640,18 @@
           <wp:inline>
             <wp:extent cx="5334000" cy="2637413"/>
             <wp:effectExtent b="0" l="0" r="0" t="0"/>
-            <wp:docPr descr="Maintenance BDD" title="" id="236" name="Picture"/>
+            <wp:docPr descr="Maintenance BDD" title="" id="241" name="Picture"/>
             <a:graphic>
               <a:graphicData uri="http://schemas.openxmlformats.org/drawingml/2006/picture">
                 <pic:pic>
                   <pic:nvPicPr>
-                    <pic:cNvPr descr="screenshots/24-maintenance-bdd.png" id="237" name="Picture"/>
+                    <pic:cNvPr descr="screenshots/24-maintenance-bdd.png" id="242" name="Picture"/>
                     <pic:cNvPicPr>
                       <a:picLocks noChangeArrowheads="1" noChangeAspect="1"/>
                     </pic:cNvPicPr>
                   </pic:nvPicPr>
                   <pic:blipFill>
-                    <a:blip r:embed="rId235"/>
+                    <a:blip r:embed="rId240"/>
                     <a:stretch>
                       <a:fillRect/>
                     </a:stretch>
@@ -18424,9 +18785,9 @@
         </w:pict>
       </w:r>
     </w:p>
-    <w:bookmarkEnd w:id="238"/>
-    <w:bookmarkEnd w:id="239"/>
-    <w:bookmarkStart w:id="244" w:name="conformité-fiscale"/>
+    <w:bookmarkEnd w:id="243"/>
+    <w:bookmarkEnd w:id="244"/>
+    <w:bookmarkStart w:id="249" w:name="conformité-fiscale"/>
     <w:p>
       <w:pPr>
         <w:pStyle w:val="Heading1"/>
@@ -18435,7 +18796,7 @@
         <w:t xml:space="preserve">Conformité fiscale</w:t>
       </w:r>
     </w:p>
-    <w:bookmarkStart w:id="240" w:name="chaîne-de-scellement-sha-256"/>
+    <w:bookmarkStart w:id="245" w:name="chaîne-de-scellement-sha-256"/>
     <w:p>
       <w:pPr>
         <w:pStyle w:val="Heading2"/>
@@ -18490,8 +18851,8 @@
         <w:t xml:space="preserve">Cette vérification prouve que les données n’ont pas été modifiées après émission, même directement dans la base.</w:t>
       </w:r>
     </w:p>
-    <w:bookmarkEnd w:id="240"/>
-    <w:bookmarkStart w:id="241" w:name="export-fec-global"/>
+    <w:bookmarkEnd w:id="245"/>
+    <w:bookmarkStart w:id="246" w:name="export-fec-global"/>
     <w:p>
       <w:pPr>
         <w:pStyle w:val="Heading2"/>
@@ -18554,8 +18915,8 @@
         <w:t xml:space="preserve">.</w:t>
       </w:r>
     </w:p>
-    <w:bookmarkEnd w:id="241"/>
-    <w:bookmarkStart w:id="242" w:name="format-factur-x-en-16931"/>
+    <w:bookmarkEnd w:id="246"/>
+    <w:bookmarkStart w:id="247" w:name="format-factur-x-en-16931"/>
     <w:p>
       <w:pPr>
         <w:pStyle w:val="Heading2"/>
@@ -18668,8 +19029,8 @@
         <w:t xml:space="preserve">- Pénalités de retard</w:t>
       </w:r>
     </w:p>
-    <w:bookmarkEnd w:id="242"/>
-    <w:bookmarkStart w:id="243" w:name="attestation-de-conformité"/>
+    <w:bookmarkEnd w:id="247"/>
+    <w:bookmarkStart w:id="248" w:name="attestation-de-conformité"/>
     <w:p>
       <w:pPr>
         <w:pStyle w:val="Heading2"/>
@@ -18703,9 +19064,9 @@
         </w:pict>
       </w:r>
     </w:p>
-    <w:bookmarkEnd w:id="243"/>
-    <w:bookmarkEnd w:id="244"/>
-    <w:bookmarkStart w:id="245" w:name="attestation-loi-anti-fraude-tva-2018"/>
+    <w:bookmarkEnd w:id="248"/>
+    <w:bookmarkEnd w:id="249"/>
+    <w:bookmarkStart w:id="250" w:name="attestation-loi-anti-fraude-tva-2018"/>
     <w:p>
       <w:pPr>
         <w:pStyle w:val="Heading1"/>
@@ -19008,7 +19369,7 @@
         <w:t xml:space="preserve">Document généré par FacturPro v3.0.0 — 2026</w:t>
       </w:r>
     </w:p>
-    <w:bookmarkEnd w:id="245"/>
+    <w:bookmarkEnd w:id="250"/>
     <w:sectPr>
       <w:footnotePr>
         <w:numRestart w:val="eachSect"/>

</xml_diff>

<commit_message>
docs: documenter la verification mensuelle de sauvegarde dans le manuel
Ajoute la section "Verification de restauration" (bouton de la page
Parametres > Sauvegarde, migration 030) ; docx regenere via pandoc.
</commit_message>
<xml_diff>
--- a/docs/manuel-utilisateur.docx
+++ b/docs/manuel-utilisateur.docx
@@ -18159,7 +18159,7 @@
     <w:bookmarkEnd w:id="228"/>
     <w:bookmarkEnd w:id="229"/>
     <w:bookmarkEnd w:id="230"/>
-    <w:bookmarkStart w:id="245" w:name="sauvegardes"/>
+    <w:bookmarkStart w:id="246" w:name="sauvegardes"/>
     <w:p>
       <w:pPr>
         <w:pStyle w:val="Heading1"/>
@@ -18568,7 +18568,160 @@
       </w:r>
     </w:p>
     <w:bookmarkEnd w:id="236"/>
-    <w:bookmarkStart w:id="240" w:name="sauvegarder-et-restaurer-une-société"/>
+    <w:bookmarkStart w:id="237" w:name="vérification-de-restauration"/>
+    <w:p>
+      <w:pPr>
+        <w:pStyle w:val="Heading2"/>
+      </w:pPr>
+      <w:r>
+        <w:t xml:space="preserve">Vérification de restauration</w:t>
+      </w:r>
+    </w:p>
+    <w:p>
+      <w:pPr>
+        <w:pStyle w:val="FirstParagraph"/>
+      </w:pPr>
+      <w:r>
+        <w:t xml:space="preserve">Pour garantir qu’une sauvegarde est réellement utilisable en cas de besoin, FacturPro la restaure automatiquement dans une base temporaire (</w:t>
+      </w:r>
+      <w:r>
+        <w:rPr>
+          <w:rStyle w:val="VerbatimChar"/>
+        </w:rPr>
+        <w:t xml:space="preserve">facturation_verify</w:t>
+      </w:r>
+      <w:r>
+        <w:t xml:space="preserve">) et compte les factures qu’elle contient. Cette vérification s’exécute :</w:t>
+      </w:r>
+    </w:p>
+    <w:p>
+      <w:pPr>
+        <w:pStyle w:val="Compact"/>
+        <w:numPr>
+          <w:ilvl w:val="0"/>
+          <w:numId w:val="1030"/>
+        </w:numPr>
+      </w:pPr>
+      <w:r>
+        <w:rPr>
+          <w:b/>
+          <w:bCs/>
+        </w:rPr>
+        <w:t xml:space="preserve">automatiquement</w:t>
+      </w:r>
+      <w:r>
+        <w:t xml:space="preserve"> </w:t>
+      </w:r>
+      <w:r>
+        <w:t xml:space="preserve">le 1er de chaque mois à 3h ;</w:t>
+      </w:r>
+    </w:p>
+    <w:p>
+      <w:pPr>
+        <w:pStyle w:val="Compact"/>
+        <w:numPr>
+          <w:ilvl w:val="0"/>
+          <w:numId w:val="1030"/>
+        </w:numPr>
+      </w:pPr>
+      <w:r>
+        <w:rPr>
+          <w:b/>
+          <w:bCs/>
+        </w:rPr>
+        <w:t xml:space="preserve">à la demande</w:t>
+      </w:r>
+      <w:r>
+        <w:t xml:space="preserve">, via le bouton</w:t>
+      </w:r>
+      <w:r>
+        <w:t xml:space="preserve"> </w:t>
+      </w:r>
+      <w:r>
+        <w:rPr>
+          <w:b/>
+          <w:bCs/>
+        </w:rPr>
+        <w:t xml:space="preserve">🔎 Vérifier la dernière sauvegarde</w:t>
+      </w:r>
+      <w:r>
+        <w:t xml:space="preserve"> </w:t>
+      </w:r>
+      <w:r>
+        <w:t xml:space="preserve">(section</w:t>
+      </w:r>
+      <w:r>
+        <w:t xml:space="preserve"> </w:t>
+      </w:r>
+      <w:r>
+        <w:rPr>
+          <w:i/>
+          <w:iCs/>
+        </w:rPr>
+        <w:t xml:space="preserve">Vérification de restauration</w:t>
+      </w:r>
+      <w:r>
+        <w:t xml:space="preserve"> </w:t>
+      </w:r>
+      <w:r>
+        <w:t xml:space="preserve">de</w:t>
+      </w:r>
+      <w:r>
+        <w:t xml:space="preserve"> </w:t>
+      </w:r>
+      <w:r>
+        <w:rPr>
+          <w:b/>
+          <w:bCs/>
+        </w:rPr>
+        <w:t xml:space="preserve">Paramètres &gt; Sauvegarde</w:t>
+      </w:r>
+      <w:r>
+        <w:t xml:space="preserve">).</w:t>
+      </w:r>
+    </w:p>
+    <w:p>
+      <w:pPr>
+        <w:pStyle w:val="FirstParagraph"/>
+      </w:pPr>
+      <w:r>
+        <w:t xml:space="preserve">Le résultat (date, succès/échec, nombre de factures, message d’erreur éventuel) est affiché dans cette même section.</w:t>
+      </w:r>
+    </w:p>
+    <w:p>
+      <w:pPr>
+        <w:pStyle w:val="BlockText"/>
+      </w:pPr>
+      <w:r>
+        <w:t xml:space="preserve">Réservé au super-administrateur. Nécessite que le rôle PostgreSQL de l’application dispose du droit</w:t>
+      </w:r>
+      <w:r>
+        <w:t xml:space="preserve"> </w:t>
+      </w:r>
+      <w:r>
+        <w:rPr>
+          <w:rStyle w:val="VerbatimChar"/>
+        </w:rPr>
+        <w:t xml:space="preserve">CREATEDB</w:t>
+      </w:r>
+      <w:r>
+        <w:t xml:space="preserve"> </w:t>
+      </w:r>
+      <w:r>
+        <w:t xml:space="preserve">(</w:t>
+      </w:r>
+      <w:r>
+        <w:rPr>
+          <w:rStyle w:val="VerbatimChar"/>
+        </w:rPr>
+        <w:t xml:space="preserve">ALTER ROLE &lt;utilisateur&gt; CREATEDB;</w:t>
+      </w:r>
+      <w:r>
+        <w:t xml:space="preserve">), sinon la vérification renvoie une erreur explicite.</w:t>
+      </w:r>
+    </w:p>
+    <w:bookmarkEnd w:id="237"/>
+    <w:bookmarkStart w:id="241" w:name="sauvegarder-et-restaurer-une-société"/>
     <w:p>
       <w:pPr>
         <w:pStyle w:val="Heading2"/>
@@ -18586,18 +18739,18 @@
           <wp:inline>
             <wp:extent cx="5334000" cy="2637413"/>
             <wp:effectExtent b="0" l="0" r="0" t="0"/>
-            <wp:docPr descr="Sauvegarde de société" title="" id="238" name="Picture"/>
+            <wp:docPr descr="Sauvegarde de société" title="" id="239" name="Picture"/>
             <a:graphic>
               <a:graphicData uri="http://schemas.openxmlformats.org/drawingml/2006/picture">
                 <pic:pic>
                   <pic:nvPicPr>
-                    <pic:cNvPr descr="screenshots/26-sauvegarde-societe.png" id="239" name="Picture"/>
+                    <pic:cNvPr descr="screenshots/26-sauvegarde-societe.png" id="240" name="Picture"/>
                     <pic:cNvPicPr>
                       <a:picLocks noChangeArrowheads="1" noChangeAspect="1"/>
                     </pic:cNvPicPr>
                   </pic:nvPicPr>
                   <pic:blipFill>
-                    <a:blip r:embed="rId237"/>
+                    <a:blip r:embed="rId238"/>
                     <a:stretch>
                       <a:fillRect/>
                     </a:stretch>
@@ -18796,8 +18949,8 @@
         <w:t xml:space="preserve">Les options de restauration/import sont réservées au super-administrateur.</w:t>
       </w:r>
     </w:p>
-    <w:bookmarkEnd w:id="240"/>
-    <w:bookmarkStart w:id="244" w:name="maintenance-de-la-base-de-données"/>
+    <w:bookmarkEnd w:id="241"/>
+    <w:bookmarkStart w:id="245" w:name="maintenance-de-la-base-de-données"/>
     <w:p>
       <w:pPr>
         <w:pStyle w:val="Heading2"/>
@@ -18815,18 +18968,18 @@
           <wp:inline>
             <wp:extent cx="5334000" cy="2637413"/>
             <wp:effectExtent b="0" l="0" r="0" t="0"/>
-            <wp:docPr descr="Maintenance BDD" title="" id="242" name="Picture"/>
+            <wp:docPr descr="Maintenance BDD" title="" id="243" name="Picture"/>
             <a:graphic>
               <a:graphicData uri="http://schemas.openxmlformats.org/drawingml/2006/picture">
                 <pic:pic>
                   <pic:nvPicPr>
-                    <pic:cNvPr descr="screenshots/24-maintenance-bdd.png" id="243" name="Picture"/>
+                    <pic:cNvPr descr="screenshots/24-maintenance-bdd.png" id="244" name="Picture"/>
                     <pic:cNvPicPr>
                       <a:picLocks noChangeArrowheads="1" noChangeAspect="1"/>
                     </pic:cNvPicPr>
                   </pic:nvPicPr>
                   <pic:blipFill>
-                    <a:blip r:embed="rId241"/>
+                    <a:blip r:embed="rId242"/>
                     <a:stretch>
                       <a:fillRect/>
                     </a:stretch>
@@ -18906,222 +19059,11 @@
         <w:pStyle w:val="Compact"/>
         <w:numPr>
           <w:ilvl w:val="0"/>
-          <w:numId w:val="1030"/>
+          <w:numId w:val="1031"/>
         </w:numPr>
       </w:pPr>
       <w:r>
         <w:t xml:space="preserve">Lancer ce nettoyage manuellement ne modifie ni ne supprime aucune donnée métier — il récupère simplement l’espace disque laissé par les lignes supprimées ou modifiées.</w:t>
-      </w:r>
-    </w:p>
-    <w:p>
-      <w:pPr>
-        <w:pStyle w:val="Compact"/>
-        <w:numPr>
-          <w:ilvl w:val="0"/>
-          <w:numId w:val="1030"/>
-        </w:numPr>
-      </w:pPr>
-      <w:r>
-        <w:t xml:space="preserve">L’opération peut ralentir temporairement l’application ; à privilégier en dehors des heures d’utilisation.</w:t>
-      </w:r>
-    </w:p>
-    <w:p>
-      <w:pPr>
-        <w:pStyle w:val="Compact"/>
-        <w:numPr>
-          <w:ilvl w:val="0"/>
-          <w:numId w:val="1030"/>
-        </w:numPr>
-      </w:pPr>
-      <w:r>
-        <w:t xml:space="preserve">L’option</w:t>
-      </w:r>
-      <w:r>
-        <w:t xml:space="preserve"> </w:t>
-      </w:r>
-      <w:r>
-        <w:rPr>
-          <w:b/>
-          <w:bCs/>
-        </w:rPr>
-        <w:t xml:space="preserve">Mode complet (FULL)</w:t>
-      </w:r>
-      <w:r>
-        <w:t xml:space="preserve"> </w:t>
-      </w:r>
-      <w:r>
-        <w:t xml:space="preserve">réécrit entièrement les tables pour récupérer le maximum d’espace possible, mais verrouille les tables concernées pendant toute la durée du traitement (l’application devient indisponible). À réserver aux cas où l’espace disque devient critique.</w:t>
-      </w:r>
-    </w:p>
-    <w:p>
-      <w:r>
-        <w:pict>
-          <v:rect style="width:0;height:1.5pt" o:hralign="center" o:hrstd="t" o:hr="t"/>
-        </w:pict>
-      </w:r>
-    </w:p>
-    <w:bookmarkEnd w:id="244"/>
-    <w:bookmarkEnd w:id="245"/>
-    <w:bookmarkStart w:id="250" w:name="conformité-fiscale"/>
-    <w:p>
-      <w:pPr>
-        <w:pStyle w:val="Heading1"/>
-      </w:pPr>
-      <w:r>
-        <w:t xml:space="preserve">Conformité fiscale</w:t>
-      </w:r>
-    </w:p>
-    <w:bookmarkStart w:id="246" w:name="chaîne-de-scellement-sha-256"/>
-    <w:p>
-      <w:pPr>
-        <w:pStyle w:val="Heading2"/>
-      </w:pPr>
-      <w:r>
-        <w:t xml:space="preserve">Chaîne de scellement SHA-256</w:t>
-      </w:r>
-    </w:p>
-    <w:p>
-      <w:pPr>
-        <w:pStyle w:val="FirstParagraph"/>
-      </w:pPr>
-      <w:r>
-        <w:t xml:space="preserve">Chaque document fiscal émis est chaîné par un hash SHA-256 cumulatif dans la table</w:t>
-      </w:r>
-      <w:r>
-        <w:t xml:space="preserve"> </w:t>
-      </w:r>
-      <w:r>
-        <w:rPr>
-          <w:rStyle w:val="VerbatimChar"/>
-        </w:rPr>
-        <w:t xml:space="preserve">journal_scellement</w:t>
-      </w:r>
-      <w:r>
-        <w:t xml:space="preserve">. Pour vérifier l’intégrité :</w:t>
-      </w:r>
-    </w:p>
-    <w:p>
-      <w:pPr>
-        <w:pStyle w:val="BodyText"/>
-      </w:pPr>
-      <w:r>
-        <w:rPr>
-          <w:b/>
-          <w:bCs/>
-        </w:rPr>
-        <w:t xml:space="preserve">Factures &gt; Vérifier le scellement</w:t>
-      </w:r>
-      <w:r>
-        <w:t xml:space="preserve"> </w:t>
-      </w:r>
-      <w:r>
-        <w:t xml:space="preserve">→ retourne ✓ si la chaîne est intacte, ou identifie le premier document altéré.</w:t>
-      </w:r>
-    </w:p>
-    <w:p>
-      <w:pPr>
-        <w:pStyle w:val="BodyText"/>
-      </w:pPr>
-      <w:r>
-        <w:t xml:space="preserve">Cette vérification prouve que les données n’ont pas été modifiées après émission, même directement dans la base.</w:t>
-      </w:r>
-    </w:p>
-    <w:bookmarkEnd w:id="246"/>
-    <w:bookmarkStart w:id="247" w:name="export-fec-global"/>
-    <w:p>
-      <w:pPr>
-        <w:pStyle w:val="Heading2"/>
-      </w:pPr>
-      <w:r>
-        <w:t xml:space="preserve">Export FEC global</w:t>
-      </w:r>
-    </w:p>
-    <w:p>
-      <w:pPr>
-        <w:pStyle w:val="FirstParagraph"/>
-      </w:pPr>
-      <w:r>
-        <w:rPr>
-          <w:b/>
-          <w:bCs/>
-        </w:rPr>
-        <w:t xml:space="preserve">Factures &gt; Export FEC</w:t>
-      </w:r>
-      <w:r>
-        <w:t xml:space="preserve"> </w:t>
-      </w:r>
-      <w:r>
-        <w:t xml:space="preserve">→ fichier texte tabulé DGFiP</w:t>
-      </w:r>
-      <w:r>
-        <w:t xml:space="preserve"> </w:t>
-      </w:r>
-      <w:r>
-        <w:rPr>
-          <w:rStyle w:val="VerbatimChar"/>
-        </w:rPr>
-        <w:t xml:space="preserve">FEC_YYYY-MM-DD.txt</w:t>
-      </w:r>
-      <w:r>
-        <w:t xml:space="preserve"> </w:t>
-      </w:r>
-      <w:r>
-        <w:t xml:space="preserve">(toutes les écritures de toutes les années).</w:t>
-      </w:r>
-    </w:p>
-    <w:p>
-      <w:pPr>
-        <w:pStyle w:val="BodyText"/>
-      </w:pPr>
-      <w:r>
-        <w:t xml:space="preserve">Pour un export par exercice :</w:t>
-      </w:r>
-      <w:r>
-        <w:t xml:space="preserve"> </w:t>
-      </w:r>
-      <w:r>
-        <w:rPr>
-          <w:b/>
-          <w:bCs/>
-        </w:rPr>
-        <w:t xml:space="preserve">Exercices &gt; ⬇ FEC 2025</w:t>
-      </w:r>
-      <w:r>
-        <w:t xml:space="preserve">.</w:t>
-      </w:r>
-    </w:p>
-    <w:bookmarkEnd w:id="247"/>
-    <w:bookmarkStart w:id="248" w:name="format-factur-x-en-16931"/>
-    <w:p>
-      <w:pPr>
-        <w:pStyle w:val="Heading2"/>
-      </w:pPr>
-      <w:r>
-        <w:t xml:space="preserve">Format Factur-X EN 16931</w:t>
-      </w:r>
-    </w:p>
-    <w:p>
-      <w:pPr>
-        <w:pStyle w:val="FirstParagraph"/>
-      </w:pPr>
-      <w:r>
-        <w:t xml:space="preserve">Chaque facture émise est un</w:t>
-      </w:r>
-      <w:r>
-        <w:t xml:space="preserve"> </w:t>
-      </w:r>
-      <w:r>
-        <w:rPr>
-          <w:b/>
-          <w:bCs/>
-        </w:rPr>
-        <w:t xml:space="preserve">PDF/A-3b</w:t>
-      </w:r>
-      <w:r>
-        <w:t xml:space="preserve"> </w:t>
-      </w:r>
-      <w:r>
-        <w:t xml:space="preserve">avec un fichier XML ZUGFeRD embarqué conforme au profil EN 16931. Ce format est :</w:t>
       </w:r>
     </w:p>
     <w:p>
@@ -19133,7 +19075,7 @@
         </w:numPr>
       </w:pPr>
       <w:r>
-        <w:t xml:space="preserve">Lisible directement par les logiciels comptables (Sage, EBP, Cegid, Pennylane…).</w:t>
+        <w:t xml:space="preserve">L’opération peut ralentir temporairement l’application ; à privilégier en dehors des heures d’utilisation.</w:t>
       </w:r>
     </w:p>
     <w:p>
@@ -19145,7 +19087,194 @@
         </w:numPr>
       </w:pPr>
       <w:r>
-        <w:t xml:space="preserve">Compatible avec l’e-invoicing européen (e-Reporting, PPF).</w:t>
+        <w:t xml:space="preserve">L’option</w:t>
+      </w:r>
+      <w:r>
+        <w:t xml:space="preserve"> </w:t>
+      </w:r>
+      <w:r>
+        <w:rPr>
+          <w:b/>
+          <w:bCs/>
+        </w:rPr>
+        <w:t xml:space="preserve">Mode complet (FULL)</w:t>
+      </w:r>
+      <w:r>
+        <w:t xml:space="preserve"> </w:t>
+      </w:r>
+      <w:r>
+        <w:t xml:space="preserve">réécrit entièrement les tables pour récupérer le maximum d’espace possible, mais verrouille les tables concernées pendant toute la durée du traitement (l’application devient indisponible). À réserver aux cas où l’espace disque devient critique.</w:t>
+      </w:r>
+    </w:p>
+    <w:p>
+      <w:r>
+        <w:pict>
+          <v:rect style="width:0;height:1.5pt" o:hralign="center" o:hrstd="t" o:hr="t"/>
+        </w:pict>
+      </w:r>
+    </w:p>
+    <w:bookmarkEnd w:id="245"/>
+    <w:bookmarkEnd w:id="246"/>
+    <w:bookmarkStart w:id="251" w:name="conformité-fiscale"/>
+    <w:p>
+      <w:pPr>
+        <w:pStyle w:val="Heading1"/>
+      </w:pPr>
+      <w:r>
+        <w:t xml:space="preserve">Conformité fiscale</w:t>
+      </w:r>
+    </w:p>
+    <w:bookmarkStart w:id="247" w:name="chaîne-de-scellement-sha-256"/>
+    <w:p>
+      <w:pPr>
+        <w:pStyle w:val="Heading2"/>
+      </w:pPr>
+      <w:r>
+        <w:t xml:space="preserve">Chaîne de scellement SHA-256</w:t>
+      </w:r>
+    </w:p>
+    <w:p>
+      <w:pPr>
+        <w:pStyle w:val="FirstParagraph"/>
+      </w:pPr>
+      <w:r>
+        <w:t xml:space="preserve">Chaque document fiscal émis est chaîné par un hash SHA-256 cumulatif dans la table</w:t>
+      </w:r>
+      <w:r>
+        <w:t xml:space="preserve"> </w:t>
+      </w:r>
+      <w:r>
+        <w:rPr>
+          <w:rStyle w:val="VerbatimChar"/>
+        </w:rPr>
+        <w:t xml:space="preserve">journal_scellement</w:t>
+      </w:r>
+      <w:r>
+        <w:t xml:space="preserve">. Pour vérifier l’intégrité :</w:t>
+      </w:r>
+    </w:p>
+    <w:p>
+      <w:pPr>
+        <w:pStyle w:val="BodyText"/>
+      </w:pPr>
+      <w:r>
+        <w:rPr>
+          <w:b/>
+          <w:bCs/>
+        </w:rPr>
+        <w:t xml:space="preserve">Factures &gt; Vérifier le scellement</w:t>
+      </w:r>
+      <w:r>
+        <w:t xml:space="preserve"> </w:t>
+      </w:r>
+      <w:r>
+        <w:t xml:space="preserve">→ retourne ✓ si la chaîne est intacte, ou identifie le premier document altéré.</w:t>
+      </w:r>
+    </w:p>
+    <w:p>
+      <w:pPr>
+        <w:pStyle w:val="BodyText"/>
+      </w:pPr>
+      <w:r>
+        <w:t xml:space="preserve">Cette vérification prouve que les données n’ont pas été modifiées après émission, même directement dans la base.</w:t>
+      </w:r>
+    </w:p>
+    <w:bookmarkEnd w:id="247"/>
+    <w:bookmarkStart w:id="248" w:name="export-fec-global"/>
+    <w:p>
+      <w:pPr>
+        <w:pStyle w:val="Heading2"/>
+      </w:pPr>
+      <w:r>
+        <w:t xml:space="preserve">Export FEC global</w:t>
+      </w:r>
+    </w:p>
+    <w:p>
+      <w:pPr>
+        <w:pStyle w:val="FirstParagraph"/>
+      </w:pPr>
+      <w:r>
+        <w:rPr>
+          <w:b/>
+          <w:bCs/>
+        </w:rPr>
+        <w:t xml:space="preserve">Factures &gt; Export FEC</w:t>
+      </w:r>
+      <w:r>
+        <w:t xml:space="preserve"> </w:t>
+      </w:r>
+      <w:r>
+        <w:t xml:space="preserve">→ fichier texte tabulé DGFiP</w:t>
+      </w:r>
+      <w:r>
+        <w:t xml:space="preserve"> </w:t>
+      </w:r>
+      <w:r>
+        <w:rPr>
+          <w:rStyle w:val="VerbatimChar"/>
+        </w:rPr>
+        <w:t xml:space="preserve">FEC_YYYY-MM-DD.txt</w:t>
+      </w:r>
+      <w:r>
+        <w:t xml:space="preserve"> </w:t>
+      </w:r>
+      <w:r>
+        <w:t xml:space="preserve">(toutes les écritures de toutes les années).</w:t>
+      </w:r>
+    </w:p>
+    <w:p>
+      <w:pPr>
+        <w:pStyle w:val="BodyText"/>
+      </w:pPr>
+      <w:r>
+        <w:t xml:space="preserve">Pour un export par exercice :</w:t>
+      </w:r>
+      <w:r>
+        <w:t xml:space="preserve"> </w:t>
+      </w:r>
+      <w:r>
+        <w:rPr>
+          <w:b/>
+          <w:bCs/>
+        </w:rPr>
+        <w:t xml:space="preserve">Exercices &gt; ⬇ FEC 2025</w:t>
+      </w:r>
+      <w:r>
+        <w:t xml:space="preserve">.</w:t>
+      </w:r>
+    </w:p>
+    <w:bookmarkEnd w:id="248"/>
+    <w:bookmarkStart w:id="249" w:name="format-factur-x-en-16931"/>
+    <w:p>
+      <w:pPr>
+        <w:pStyle w:val="Heading2"/>
+      </w:pPr>
+      <w:r>
+        <w:t xml:space="preserve">Format Factur-X EN 16931</w:t>
+      </w:r>
+    </w:p>
+    <w:p>
+      <w:pPr>
+        <w:pStyle w:val="FirstParagraph"/>
+      </w:pPr>
+      <w:r>
+        <w:t xml:space="preserve">Chaque facture émise est un</w:t>
+      </w:r>
+      <w:r>
+        <w:t xml:space="preserve"> </w:t>
+      </w:r>
+      <w:r>
+        <w:rPr>
+          <w:b/>
+          <w:bCs/>
+        </w:rPr>
+        <w:t xml:space="preserve">PDF/A-3b</w:t>
+      </w:r>
+      <w:r>
+        <w:t xml:space="preserve"> </w:t>
+      </w:r>
+      <w:r>
+        <w:t xml:space="preserve">avec un fichier XML ZUGFeRD embarqué conforme au profil EN 16931. Ce format est :</w:t>
       </w:r>
     </w:p>
     <w:p>
@@ -19153,10 +19282,34 @@
         <w:pStyle w:val="Compact"/>
         <w:numPr>
           <w:ilvl w:val="0"/>
-          <w:numId w:val="1031"/>
+          <w:numId w:val="1032"/>
         </w:numPr>
       </w:pPr>
       <w:r>
+        <w:t xml:space="preserve">Lisible directement par les logiciels comptables (Sage, EBP, Cegid, Pennylane…).</w:t>
+      </w:r>
+    </w:p>
+    <w:p>
+      <w:pPr>
+        <w:pStyle w:val="Compact"/>
+        <w:numPr>
+          <w:ilvl w:val="0"/>
+          <w:numId w:val="1032"/>
+        </w:numPr>
+      </w:pPr>
+      <w:r>
+        <w:t xml:space="preserve">Compatible avec l’e-invoicing européen (e-Reporting, PPF).</w:t>
+      </w:r>
+    </w:p>
+    <w:p>
+      <w:pPr>
+        <w:pStyle w:val="Compact"/>
+        <w:numPr>
+          <w:ilvl w:val="0"/>
+          <w:numId w:val="1032"/>
+        </w:numPr>
+      </w:pPr>
+      <w:r>
         <w:t xml:space="preserve">Obligatoire à partir de 2026 pour les transactions B2B en France.</w:t>
       </w:r>
     </w:p>
@@ -19204,8 +19357,8 @@
         <w:t xml:space="preserve">- Pénalités de retard</w:t>
       </w:r>
     </w:p>
-    <w:bookmarkEnd w:id="248"/>
-    <w:bookmarkStart w:id="249" w:name="attestation-de-conformité"/>
+    <w:bookmarkEnd w:id="249"/>
+    <w:bookmarkStart w:id="250" w:name="attestation-de-conformité"/>
     <w:p>
       <w:pPr>
         <w:pStyle w:val="Heading2"/>
@@ -19239,9 +19392,9 @@
         </w:pict>
       </w:r>
     </w:p>
-    <w:bookmarkEnd w:id="249"/>
     <w:bookmarkEnd w:id="250"/>
-    <w:bookmarkStart w:id="251" w:name="attestation-loi-anti-fraude-tva-2018"/>
+    <w:bookmarkEnd w:id="251"/>
+    <w:bookmarkStart w:id="252" w:name="attestation-loi-anti-fraude-tva-2018"/>
     <w:p>
       <w:pPr>
         <w:pStyle w:val="Heading1"/>
@@ -19544,7 +19697,7 @@
         <w:t xml:space="preserve">Document généré par FacturPro v3.0.0 — 2026</w:t>
       </w:r>
     </w:p>
-    <w:bookmarkEnd w:id="251"/>
+    <w:bookmarkEnd w:id="252"/>
     <w:sectPr>
       <w:footnotePr>
         <w:numRestart w:val="eachSect"/>
@@ -20288,6 +20441,9 @@
     <w:abstractNumId w:val="991"/>
   </w:num>
   <w:num w:numId="1031">
+    <w:abstractNumId w:val="991"/>
+  </w:num>
+  <w:num w:numId="1032">
     <w:abstractNumId w:val="991"/>
   </w:num>
 </w:numbering>

</xml_diff>